<commit_message>
fix(ci): menor privilégio nos workflows e atualiza docs do Docker ativo
- permissions: contents: read no topo de ci.yml e docker-build.yml
  (corrige 11 alertas CodeQL actions/missing-workflow-permissions)
- ROTEIRO Passo 7 reescrito com o estado real (compose, gatilhos, lições)
- SETUP_NOVA_MAQUINA, DEVOPS_GUIA, PROMPT_INICIAL e agente devops-engineer
  sem a restrição antiga de Docker
- docs/atualizar_docx.sh regenera os .docx a partir dos .md (pandoc via Docker)
- .venv/ no .gitignore

Co-Authored-By: Claude Opus 5.5 <noreply@anthropic.com>
</commit_message>
<xml_diff>
--- a/docs/COLABORACAO_EQUIPE.docx
+++ b/docs/COLABORACAO_EQUIPE.docx
@@ -2,49 +2,14 @@
 <file path=word/document.xml><?xml version="1.0" encoding="utf-8"?>
 <w:document xmlns:w="http://schemas.openxmlformats.org/wordprocessingml/2006/main" xmlns:m="http://schemas.openxmlformats.org/officeDocument/2006/math" xmlns:r="http://schemas.openxmlformats.org/officeDocument/2006/relationships" xmlns:o="urn:schemas-microsoft-com:office:office" xmlns:v="urn:schemas-microsoft-com:vml" xmlns:w10="urn:schemas-microsoft-com:office:word" xmlns:a="http://schemas.openxmlformats.org/drawingml/2006/main" xmlns:pic="http://schemas.openxmlformats.org/drawingml/2006/picture" xmlns:wp="http://schemas.openxmlformats.org/drawingml/2006/wordprocessingDrawing">
   <w:body>
-    <w:p>
-      <w:pPr>
-        <w:pStyle w:val="Title"/>
-      </w:pPr>
-      <w:r>
-        <w:t xml:space="preserve">Colaboração em Equipe — CI/CD</w:t>
-      </w:r>
-    </w:p>
-    <w:sdt>
-      <w:sdtPr>
-        <w:docPartObj>
-          <w:docPartGallery w:val="Table of Contents"/>
-          <w:docPartUnique/>
-        </w:docPartObj>
-      </w:sdtPr>
-      <w:sdtContent>
-        <w:p>
-          <w:pPr>
-            <w:pStyle w:val="TOCHeading"/>
-          </w:pPr>
-          <w:r>
-            <w:t xml:space="preserve">Table of Contents</w:t>
-          </w:r>
-        </w:p>
-        <w:p>
-          <w:r>
-            <w:fldChar w:fldCharType="begin" w:dirty="true"/>
-            <w:instrText xml:space="preserve">TOC \o "1-2" \h \z \u</w:instrText>
-            <w:fldChar w:fldCharType="separate"/>
-            <w:fldChar w:fldCharType="end"/>
-          </w:r>
-        </w:p>
-      </w:sdtContent>
-    </w:sdt>
+    <w:bookmarkStart w:id="34" w:name="Xe659def3f9673db41f4c69674d6d5c4e113681e"/>
     <w:p>
       <w:pPr>
         <w:pStyle w:val="Heading1"/>
       </w:pPr>
-      <w:bookmarkStart w:id="20" w:name="X57ddd79167eaf0d1815ec0e098e0555a68f5ccb"/>
       <w:r>
         <w:t xml:space="preserve">Trabalho em equipe na esteira de CI/CD — vários devs, um repositório só</w:t>
       </w:r>
-      <w:bookmarkEnd w:id="20"/>
     </w:p>
     <w:p>
       <w:pPr>
@@ -78,22 +43,7 @@
         <w:t xml:space="preserve">docs/ROTEIRO_CICD_CLAUDE_CODE.md</w:t>
       </w:r>
       <w:r>
-        <w:t xml:space="preserve">. Enquanto aqueles documentos tratam de</w:t>
-      </w:r>
-      <w:r>
-        <w:t xml:space="preserve"> </w:t>
-      </w:r>
-      <w:r>
-        <w:t xml:space="preserve">“</w:t>
-      </w:r>
-      <w:r>
-        <w:t xml:space="preserve">como construir a esteira</w:t>
-      </w:r>
-      <w:r>
-        <w:t xml:space="preserve">”</w:t>
-      </w:r>
-      <w:r>
-        <w:t xml:space="preserve">, este trata de</w:t>
+        <w:t xml:space="preserve">. Enquanto aqueles documentos tratam de "como construir a esteira", este trata de</w:t>
       </w:r>
       <w:r>
         <w:t xml:space="preserve"> </w:t>
@@ -101,20 +51,9 @@
       <w:r>
         <w:rPr>
           <w:b/>
-        </w:rPr>
-        <w:t xml:space="preserve">“</w:t>
-      </w:r>
-      <w:r>
-        <w:rPr>
-          <w:b/>
-        </w:rPr>
-        <w:t xml:space="preserve">como várias pessoas usam a mesma esteira ao mesmo tempo sem destruir o trabalho umas das outras</w:t>
-      </w:r>
-      <w:r>
-        <w:rPr>
-          <w:b/>
-        </w:rPr>
-        <w:t xml:space="preserve">”</w:t>
+          <w:bCs/>
+        </w:rPr>
+        <w:t xml:space="preserve">"como várias pessoas usam a mesma esteira ao mesmo tempo sem destruir o trabalho umas das outras"</w:t>
       </w:r>
       <w:r>
         <w:t xml:space="preserve">.</w:t>
@@ -150,15 +89,14 @@
         </w:pict>
       </w:r>
     </w:p>
+    <w:bookmarkStart w:id="9" w:name="X8b50eb1fa51d8bb029ded596354bd58c82eac01"/>
     <w:p>
       <w:pPr>
         <w:pStyle w:val="Heading2"/>
       </w:pPr>
-      <w:bookmarkStart w:id="21" w:name="o-problema-em-uma-frase"/>
       <w:r>
         <w:t xml:space="preserve">1. O problema, em uma frase</w:t>
       </w:r>
-      <w:bookmarkEnd w:id="21"/>
     </w:p>
     <w:p>
       <w:pPr>
@@ -173,6 +111,7 @@
       <w:r>
         <w:rPr>
           <w:b/>
+          <w:bCs/>
         </w:rPr>
         <w:t xml:space="preserve">mesmo repositório</w:t>
       </w:r>
@@ -185,6 +124,7 @@
       <w:r>
         <w:rPr>
           <w:b/>
+          <w:bCs/>
         </w:rPr>
         <w:t xml:space="preserve">mesmo arquivo</w:t>
       </w:r>
@@ -194,78 +134,81 @@
     </w:p>
     <w:p>
       <w:pPr>
+        <w:pStyle w:val="Compact"/>
         <w:numPr>
           <w:ilvl w:val="0"/>
           <w:numId w:val="1001"/>
         </w:numPr>
+      </w:pPr>
+      <w:r>
+        <w:rPr>
+          <w:b/>
+          <w:bCs/>
+        </w:rPr>
+        <w:t xml:space="preserve">Isolamento</w:t>
+      </w:r>
+      <w:r>
+        <w:t xml:space="preserve">: cada tarefa acontece em uma branch separada — ninguém trabalha direto na</w:t>
+      </w:r>
+      <w:r>
+        <w:t xml:space="preserve"> </w:t>
+      </w:r>
+      <w:r>
+        <w:rPr>
+          <w:rStyle w:val="VerbatimChar"/>
+        </w:rPr>
+        <w:t xml:space="preserve">main</w:t>
+      </w:r>
+      <w:r>
+        <w:t xml:space="preserve">.</w:t>
+      </w:r>
+    </w:p>
+    <w:p>
+      <w:pPr>
         <w:pStyle w:val="Compact"/>
-      </w:pPr>
-      <w:r>
-        <w:rPr>
-          <w:b/>
-        </w:rPr>
-        <w:t xml:space="preserve">Isolamento</w:t>
-      </w:r>
-      <w:r>
-        <w:t xml:space="preserve">: cada tarefa acontece em uma branch separada — ninguém trabalha direto na</w:t>
-      </w:r>
-      <w:r>
-        <w:t xml:space="preserve"> </w:t>
-      </w:r>
-      <w:r>
-        <w:rPr>
-          <w:rStyle w:val="VerbatimChar"/>
-        </w:rPr>
-        <w:t xml:space="preserve">main</w:t>
-      </w:r>
-      <w:r>
-        <w:t xml:space="preserve">.</w:t>
-      </w:r>
-    </w:p>
-    <w:p>
-      <w:pPr>
         <w:numPr>
           <w:ilvl w:val="0"/>
           <w:numId w:val="1001"/>
         </w:numPr>
+      </w:pPr>
+      <w:r>
+        <w:rPr>
+          <w:b/>
+          <w:bCs/>
+        </w:rPr>
+        <w:t xml:space="preserve">Governança</w:t>
+      </w:r>
+      <w:r>
+        <w:t xml:space="preserve">: ninguém entra na</w:t>
+      </w:r>
+      <w:r>
+        <w:t xml:space="preserve"> </w:t>
+      </w:r>
+      <w:r>
+        <w:rPr>
+          <w:rStyle w:val="VerbatimChar"/>
+        </w:rPr>
+        <w:t xml:space="preserve">main</w:t>
+      </w:r>
+      <w:r>
+        <w:t xml:space="preserve"> </w:t>
+      </w:r>
+      <w:r>
+        <w:t xml:space="preserve">sem passar por Pull Request + revisão + esteira verde.</w:t>
+      </w:r>
+    </w:p>
+    <w:p>
+      <w:pPr>
         <w:pStyle w:val="Compact"/>
-      </w:pPr>
-      <w:r>
-        <w:rPr>
-          <w:b/>
-        </w:rPr>
-        <w:t xml:space="preserve">Governança</w:t>
-      </w:r>
-      <w:r>
-        <w:t xml:space="preserve">: ninguém entra na</w:t>
-      </w:r>
-      <w:r>
-        <w:t xml:space="preserve"> </w:t>
-      </w:r>
-      <w:r>
-        <w:rPr>
-          <w:rStyle w:val="VerbatimChar"/>
-        </w:rPr>
-        <w:t xml:space="preserve">main</w:t>
-      </w:r>
-      <w:r>
-        <w:t xml:space="preserve"> </w:t>
-      </w:r>
-      <w:r>
-        <w:t xml:space="preserve">sem passar por Pull Request + revisão + esteira verde.</w:t>
-      </w:r>
-    </w:p>
-    <w:p>
-      <w:pPr>
         <w:numPr>
           <w:ilvl w:val="0"/>
           <w:numId w:val="1001"/>
         </w:numPr>
-        <w:pStyle w:val="Compact"/>
       </w:pPr>
       <w:r>
         <w:rPr>
           <w:b/>
+          <w:bCs/>
         </w:rPr>
         <w:t xml:space="preserve">Reconciliação</w:t>
       </w:r>
@@ -278,6 +221,7 @@
       <w:r>
         <w:rPr>
           <w:i/>
+          <w:iCs/>
         </w:rPr>
         <w:t xml:space="preserve">de fato</w:t>
       </w:r>
@@ -285,22 +229,7 @@
         <w:t xml:space="preserve"> </w:t>
       </w:r>
       <w:r>
-        <w:t xml:space="preserve">mexeram na mesma linha, o Git força uma decisão humana explícita (o</w:t>
-      </w:r>
-      <w:r>
-        <w:t xml:space="preserve"> </w:t>
-      </w:r>
-      <w:r>
-        <w:t xml:space="preserve">“</w:t>
-      </w:r>
-      <w:r>
-        <w:t xml:space="preserve">conflito de merge</w:t>
-      </w:r>
-      <w:r>
-        <w:t xml:space="preserve">”</w:t>
-      </w:r>
-      <w:r>
-        <w:t xml:space="preserve">) — ele nunca decide sozinho e nunca apaga silenciosamente o trabalho de alguém.</w:t>
+        <w:t xml:space="preserve">mexeram na mesma linha, o Git força uma decisão humana explícita (o "conflito de merge") — ele nunca decide sozinho e nunca apaga silenciosamente o trabalho de alguém.</w:t>
       </w:r>
     </w:p>
     <w:p>
@@ -310,25 +239,24 @@
         </w:pict>
       </w:r>
     </w:p>
+    <w:bookmarkEnd w:id="9"/>
+    <w:bookmarkStart w:id="14" w:name="X484d5963f9333fe2bd89b5c3d6f86210a3debbd"/>
     <w:p>
       <w:pPr>
         <w:pStyle w:val="Heading2"/>
       </w:pPr>
-      <w:bookmarkStart w:id="22" w:name="X65a5fae9f4a63eb41fcab0e497217e9804b7a6a"/>
       <w:r>
         <w:t xml:space="preserve">2. Isolamento — como cada dev pega uma tarefa sem atropelar o outro</w:t>
       </w:r>
-      <w:bookmarkEnd w:id="22"/>
-    </w:p>
+    </w:p>
+    <w:bookmarkStart w:id="10" w:name="X2fadb4cd6ad634f23615820a4372001b5b603a4"/>
     <w:p>
       <w:pPr>
         <w:pStyle w:val="Heading3"/>
       </w:pPr>
-      <w:bookmarkStart w:id="23" w:name="o-backlog-é-a-fonte-única-de-tarefas"/>
       <w:r>
         <w:t xml:space="preserve">2.1 O backlog é a fonte única de tarefas</w:t>
       </w:r>
-      <w:bookmarkEnd w:id="23"/>
     </w:p>
     <w:p>
       <w:pPr>
@@ -343,6 +271,7 @@
       <w:r>
         <w:rPr>
           <w:b/>
+          <w:bCs/>
         </w:rPr>
         <w:t xml:space="preserve">Issue</w:t>
       </w:r>
@@ -365,25 +294,7 @@
         <w:t xml:space="preserve"> </w:t>
       </w:r>
       <w:r>
-        <w:t xml:space="preserve">para o board). Isso evita duas pessoas decidirem</w:t>
-      </w:r>
-      <w:r>
-        <w:t xml:space="preserve"> </w:t>
-      </w:r>
-      <w:r>
-        <w:t xml:space="preserve">“</w:t>
-      </w:r>
-      <w:r>
-        <w:t xml:space="preserve">por fora</w:t>
-      </w:r>
-      <w:r>
-        <w:t xml:space="preserve">”</w:t>
-      </w:r>
-      <w:r>
-        <w:t xml:space="preserve"> </w:t>
-      </w:r>
-      <w:r>
-        <w:t xml:space="preserve">que vão mexer na mesma coisa — o board deixa visível quem está fazendo o quê.</w:t>
+        <w:t xml:space="preserve">para o board). Isso evita duas pessoas decidirem "por fora" que vão mexer na mesma coisa — o board deixa visível quem está fazendo o quê.</w:t>
       </w:r>
     </w:p>
     <w:p>
@@ -414,15 +325,15 @@
         <w:t xml:space="preserve">   ↑ backlog        ↑ dev "pegou"          ↑ CI + review              ↑ merge feito</w:t>
       </w:r>
     </w:p>
+    <w:bookmarkEnd w:id="10"/>
+    <w:bookmarkStart w:id="11" w:name="X4866af4f6301fe90ddc209632f5664d10f66dfe"/>
     <w:p>
       <w:pPr>
         <w:pStyle w:val="Heading3"/>
       </w:pPr>
-      <w:bookmarkStart w:id="24" w:name="X77b730471eb6267ea417a02f0a96e29506d2427"/>
       <w:r>
         <w:t xml:space="preserve">2.2 Cada tarefa vira uma branch curta e isolada</w:t>
       </w:r>
-      <w:bookmarkEnd w:id="24"/>
     </w:p>
     <w:p>
       <w:pPr>
@@ -437,12 +348,14 @@
       <w:r>
         <w:rPr>
           <w:b/>
+          <w:bCs/>
         </w:rPr>
         <w:t xml:space="preserve">a partir da</w:t>
       </w:r>
       <w:r>
         <w:rPr>
           <w:b/>
+          <w:bCs/>
         </w:rPr>
         <w:t xml:space="preserve"> </w:t>
       </w:r>
@@ -450,18 +363,21 @@
         <w:rPr>
           <w:rStyle w:val="VerbatimChar"/>
           <w:b/>
+          <w:bCs/>
         </w:rPr>
         <w:t xml:space="preserve">main</w:t>
       </w:r>
       <w:r>
         <w:rPr>
           <w:b/>
+          <w:bCs/>
         </w:rPr>
         <w:t xml:space="preserve"> </w:t>
       </w:r>
       <w:r>
         <w:rPr>
           <w:b/>
+          <w:bCs/>
         </w:rPr>
         <w:t xml:space="preserve">atualizada</w:t>
       </w:r>
@@ -498,7 +414,13 @@
         <w:rPr>
           <w:rStyle w:val="NormalTok"/>
         </w:rPr>
-        <w:t xml:space="preserve"> pull origin main                     # main atualizada — ponto de partida limpo</w:t>
+        <w:t xml:space="preserve"> pull origin main                     </w:t>
+      </w:r>
+      <w:r>
+        <w:rPr>
+          <w:rStyle w:val="CommentTok"/>
+        </w:rPr>
+        <w:t xml:space="preserve"># main atualizada — ponto de partida limpo</w:t>
       </w:r>
       <w:r>
         <w:br/>
@@ -513,7 +435,25 @@
         <w:rPr>
           <w:rStyle w:val="NormalTok"/>
         </w:rPr>
-        <w:t xml:space="preserve"> checkout -b feature/123-corrigir-validacao-cnpj   # 123 = número da issue</w:t>
+        <w:t xml:space="preserve"> checkout </w:t>
+      </w:r>
+      <w:r>
+        <w:rPr>
+          <w:rStyle w:val="AttributeTok"/>
+        </w:rPr>
+        <w:t xml:space="preserve">-b</w:t>
+      </w:r>
+      <w:r>
+        <w:rPr>
+          <w:rStyle w:val="NormalTok"/>
+        </w:rPr>
+        <w:t xml:space="preserve"> feature/123-corrigir-validacao-cnpj   </w:t>
+      </w:r>
+      <w:r>
+        <w:rPr>
+          <w:rStyle w:val="CommentTok"/>
+        </w:rPr>
+        <w:t xml:space="preserve"># 123 = número da issue</w:t>
       </w:r>
     </w:p>
     <w:p>
@@ -609,6 +549,7 @@
       <w:r>
         <w:rPr>
           <w:b/>
+          <w:bCs/>
         </w:rPr>
         <w:t xml:space="preserve">Por que isso evita atropelo:</w:t>
       </w:r>
@@ -624,6 +565,7 @@
       <w:r>
         <w:rPr>
           <w:b/>
+          <w:bCs/>
         </w:rPr>
         <w:t xml:space="preserve">não aparece</w:t>
       </w:r>
@@ -646,15 +588,15 @@
         <w:t xml:space="preserve">, até que ele explicitamente abra e tenha aprovado um Pull Request. Dois devs podem trabalhar em arquivos completamente diferentes, ou até no mesmo arquivo, sem qualquer interferência até o momento do merge.</w:t>
       </w:r>
     </w:p>
+    <w:bookmarkEnd w:id="11"/>
+    <w:bookmarkStart w:id="12" w:name="X20260899e8bfc80ebbae19cc4cf197767965c7f"/>
     <w:p>
       <w:pPr>
         <w:pStyle w:val="Heading3"/>
       </w:pPr>
-      <w:bookmarkStart w:id="25" w:name="branches-curtas-branches-longas"/>
       <w:r>
         <w:t xml:space="preserve">2.3 Branches curtas &gt; branches longas</w:t>
       </w:r>
-      <w:bookmarkEnd w:id="25"/>
     </w:p>
     <w:p>
       <w:pPr>
@@ -681,6 +623,7 @@
       <w:r>
         <w:rPr>
           <w:b/>
+          <w:bCs/>
         </w:rPr>
         <w:t xml:space="preserve">horas ou 1–2 dias</w:t>
       </w:r>
@@ -688,11 +631,12 @@
         <w:t xml:space="preserve">, não semanas. Tarefas grandes demais para isso devem ser quebradas em tarefas menores no backlog.</w:t>
       </w:r>
     </w:p>
+    <w:bookmarkEnd w:id="12"/>
+    <w:bookmarkStart w:id="13" w:name="X9498bb849cde20e12c2af5f2448fa470346c73b"/>
     <w:p>
       <w:pPr>
         <w:pStyle w:val="Heading3"/>
       </w:pPr>
-      <w:bookmarkStart w:id="26" w:name="X931b2c44b1368093580d6012e9832da840e4f43"/>
       <w:r>
         <w:t xml:space="preserve">2.4 Trazer a</w:t>
       </w:r>
@@ -711,7 +655,6 @@
       <w:r>
         <w:t xml:space="preserve">para dentro da sua branch com frequência</w:t>
       </w:r>
-      <w:bookmarkEnd w:id="26"/>
     </w:p>
     <w:p>
       <w:pPr>
@@ -762,7 +705,13 @@
         <w:rPr>
           <w:rStyle w:val="NormalTok"/>
         </w:rPr>
-        <w:t xml:space="preserve"> rebase origin/main     # reaplica seus commits em cima da main atualizada</w:t>
+        <w:t xml:space="preserve"> rebase origin/main     </w:t>
+      </w:r>
+      <w:r>
+        <w:rPr>
+          <w:rStyle w:val="CommentTok"/>
+        </w:rPr>
+        <w:t xml:space="preserve"># reaplica seus commits em cima da main atualizada</w:t>
       </w:r>
       <w:r>
         <w:br/>
@@ -779,43 +728,7 @@
         <w:pStyle w:val="FirstParagraph"/>
       </w:pPr>
       <w:r>
-        <w:t xml:space="preserve">Fazer isso a cada poucas horas, em vez de só no fim, transforma</w:t>
-      </w:r>
-      <w:r>
-        <w:t xml:space="preserve"> </w:t>
-      </w:r>
-      <w:r>
-        <w:t xml:space="preserve">“</w:t>
-      </w:r>
-      <w:r>
-        <w:t xml:space="preserve">um conflito gigante no fim</w:t>
-      </w:r>
-      <w:r>
-        <w:t xml:space="preserve">”</w:t>
-      </w:r>
-      <w:r>
-        <w:t xml:space="preserve"> </w:t>
-      </w:r>
-      <w:r>
-        <w:t xml:space="preserve">em</w:t>
-      </w:r>
-      <w:r>
-        <w:t xml:space="preserve"> </w:t>
-      </w:r>
-      <w:r>
-        <w:t xml:space="preserve">“</w:t>
-      </w:r>
-      <w:r>
-        <w:t xml:space="preserve">vários conflitos pequenos e administráveis ao longo do caminho</w:t>
-      </w:r>
-      <w:r>
-        <w:t xml:space="preserve">”</w:t>
-      </w:r>
-      <w:r>
-        <w:t xml:space="preserve"> </w:t>
-      </w:r>
-      <w:r>
-        <w:t xml:space="preserve">(ou nenhum).</w:t>
+        <w:t xml:space="preserve">Fazer isso a cada poucas horas, em vez de só no fim, transforma "um conflito gigante no fim" em "vários conflitos pequenos e administráveis ao longo do caminho" (ou nenhum).</w:t>
       </w:r>
     </w:p>
     <w:p>
@@ -825,11 +738,13 @@
         </w:pict>
       </w:r>
     </w:p>
+    <w:bookmarkEnd w:id="13"/>
+    <w:bookmarkEnd w:id="14"/>
+    <w:bookmarkStart w:id="19" w:name="X6592ccb2e7621daf0c0eac3880a6360d52b8dc9"/>
     <w:p>
       <w:pPr>
         <w:pStyle w:val="Heading2"/>
       </w:pPr>
-      <w:bookmarkStart w:id="27" w:name="X9e008d0d5b93ee6e4f48750386f247abbbe1e09"/>
       <w:r>
         <w:t xml:space="preserve">3. Governança — ninguém entra na</w:t>
       </w:r>
@@ -848,17 +763,15 @@
       <w:r>
         <w:t xml:space="preserve">sem esteira e revisão</w:t>
       </w:r>
-      <w:bookmarkEnd w:id="27"/>
-    </w:p>
+    </w:p>
+    <w:bookmarkStart w:id="15" w:name="X0a01df4025e127a68f60861a8823916d6502f32"/>
     <w:p>
       <w:pPr>
         <w:pStyle w:val="Heading3"/>
       </w:pPr>
-      <w:bookmarkStart w:id="28" w:name="branch-protection-repository-rulesets"/>
       <w:r>
         <w:t xml:space="preserve">3.1 Branch protection / Repository Rulesets</w:t>
       </w:r>
-      <w:bookmarkEnd w:id="28"/>
     </w:p>
     <w:p>
       <w:pPr>
@@ -910,8 +823,8 @@
     <w:tbl>
       <w:tblPr>
         <w:tblStyle w:val="Table"/>
-        <w:tblW w:type="pct" w:w="5000.0"/>
-        <w:tblLook w:firstRow="1"/>
+        <w:tblW w:type="auto" w:w="0"/>
+        <w:tblLook w:firstRow="1" w:lastRow="0" w:firstColumn="0" w:lastColumn="0" w:noHBand="0" w:noVBand="0" w:val="0020"/>
       </w:tblPr>
       <w:tblGrid>
         <w:gridCol w:w="3960"/>
@@ -919,19 +832,13 @@
       </w:tblGrid>
       <w:tr>
         <w:trPr>
-          <w:cnfStyle w:firstRow="1"/>
+          <w:tblHeader w:val="on"/>
         </w:trPr>
         <w:tc>
-          <w:tcPr>
-            <w:tcBorders>
-              <w:bottom w:val="single"/>
-            </w:tcBorders>
-            <w:vAlign w:val="bottom"/>
-          </w:tcPr>
+          <w:tcPr/>
           <w:p>
             <w:pPr>
               <w:pStyle w:val="Compact"/>
-              <w:jc w:val="left"/>
             </w:pPr>
             <w:r>
               <w:t xml:space="preserve">Regra</w:t>
@@ -939,16 +846,10 @@
           </w:p>
         </w:tc>
         <w:tc>
-          <w:tcPr>
-            <w:tcBorders>
-              <w:bottom w:val="single"/>
-            </w:tcBorders>
-            <w:vAlign w:val="bottom"/>
-          </w:tcPr>
+          <w:tcPr/>
           <w:p>
             <w:pPr>
               <w:pStyle w:val="Compact"/>
-              <w:jc w:val="left"/>
             </w:pPr>
             <w:r>
               <w:t xml:space="preserve">Por quê</w:t>
@@ -958,10 +859,10 @@
       </w:tr>
       <w:tr>
         <w:tc>
+          <w:tcPr/>
           <w:p>
             <w:pPr>
               <w:pStyle w:val="Compact"/>
-              <w:jc w:val="left"/>
             </w:pPr>
             <w:r>
               <w:t xml:space="preserve">Exigir Pull Request antes de merge</w:t>
@@ -969,10 +870,10 @@
           </w:p>
         </w:tc>
         <w:tc>
+          <w:tcPr/>
           <w:p>
             <w:pPr>
               <w:pStyle w:val="Compact"/>
-              <w:jc w:val="left"/>
             </w:pPr>
             <w:r>
               <w:t xml:space="preserve">Ninguém edita a</w:t>
@@ -997,10 +898,10 @@
       </w:tr>
       <w:tr>
         <w:tc>
+          <w:tcPr/>
           <w:p>
             <w:pPr>
               <w:pStyle w:val="Compact"/>
-              <w:jc w:val="left"/>
             </w:pPr>
             <w:r>
               <w:t xml:space="preserve">Exigir 1+ aprovação (2 para arquivos sensíveis, via CODEOWNERS)</w:t>
@@ -1008,10 +909,10 @@
           </w:p>
         </w:tc>
         <w:tc>
+          <w:tcPr/>
           <w:p>
             <w:pPr>
               <w:pStyle w:val="Compact"/>
-              <w:jc w:val="left"/>
             </w:pPr>
             <w:r>
               <w:t xml:space="preserve">Segundo par de olhos antes de produção</w:t>
@@ -1021,10 +922,10 @@
       </w:tr>
       <w:tr>
         <w:tc>
+          <w:tcPr/>
           <w:p>
             <w:pPr>
               <w:pStyle w:val="Compact"/>
-              <w:jc w:val="left"/>
             </w:pPr>
             <w:r>
               <w:t xml:space="preserve">Exigir que os checks do</w:t>
@@ -1047,41 +948,23 @@
           </w:p>
         </w:tc>
         <w:tc>
+          <w:tcPr/>
           <w:p>
             <w:pPr>
               <w:pStyle w:val="Compact"/>
-              <w:jc w:val="left"/>
             </w:pPr>
             <w:r>
-              <w:t xml:space="preserve">A esteira é o</w:t>
-            </w:r>
-            <w:r>
-              <w:t xml:space="preserve"> </w:t>
-            </w:r>
-            <w:r>
-              <w:t xml:space="preserve">“</w:t>
-            </w:r>
-            <w:r>
-              <w:t xml:space="preserve">juiz</w:t>
-            </w:r>
-            <w:r>
-              <w:t xml:space="preserve">”</w:t>
-            </w:r>
-            <w:r>
-              <w:t xml:space="preserve"> </w:t>
-            </w:r>
-            <w:r>
-              <w:t xml:space="preserve">objetivo — não é opinião de ninguém</w:t>
+              <w:t xml:space="preserve">A esteira é o "juiz" objetivo — não é opinião de ninguém</w:t>
             </w:r>
           </w:p>
         </w:tc>
       </w:tr>
       <w:tr>
         <w:tc>
+          <w:tcPr/>
           <w:p>
             <w:pPr>
               <w:pStyle w:val="Compact"/>
-              <w:jc w:val="left"/>
             </w:pPr>
             <w:r>
               <w:t xml:space="preserve">Exigir que a branch esteja atualizada com a</w:t>
@@ -1104,10 +987,10 @@
           </w:p>
         </w:tc>
         <w:tc>
+          <w:tcPr/>
           <w:p>
             <w:pPr>
               <w:pStyle w:val="Compact"/>
-              <w:jc w:val="left"/>
             </w:pPr>
             <w:r>
               <w:t xml:space="preserve">Garante que o PR foi testado</w:t>
@@ -1118,6 +1001,7 @@
             <w:r>
               <w:rPr>
                 <w:i/>
+                <w:iCs/>
               </w:rPr>
               <w:t xml:space="preserve">com</w:t>
             </w:r>
@@ -1132,10 +1016,10 @@
       </w:tr>
       <w:tr>
         <w:tc>
+          <w:tcPr/>
           <w:p>
             <w:pPr>
               <w:pStyle w:val="Compact"/>
-              <w:jc w:val="left"/>
             </w:pPr>
             <w:r>
               <w:t xml:space="preserve">Bloquear force-push e deleção da</w:t>
@@ -1152,10 +1036,10 @@
           </w:p>
         </w:tc>
         <w:tc>
+          <w:tcPr/>
           <w:p>
             <w:pPr>
               <w:pStyle w:val="Compact"/>
-              <w:jc w:val="left"/>
             </w:pPr>
             <w:r>
               <w:t xml:space="preserve">Ninguém reescreve o histórico compartilhado</w:t>
@@ -1164,15 +1048,15 @@
         </w:tc>
       </w:tr>
     </w:tbl>
+    <w:bookmarkEnd w:id="15"/>
+    <w:bookmarkStart w:id="16" w:name="Xac7043f20a5ca00dee703d5829b454f31f78887"/>
     <w:p>
       <w:pPr>
         <w:pStyle w:val="Heading3"/>
       </w:pPr>
-      <w:bookmarkStart w:id="29" w:name="X04370f0e270e4e221510e7e147b4a543b220cb7"/>
       <w:r>
         <w:t xml:space="preserve">3.2 CODEOWNERS — revisão obrigatória por dono da área</w:t>
       </w:r>
-      <w:bookmarkEnd w:id="29"/>
     </w:p>
     <w:p>
       <w:pPr>
@@ -1202,6 +1086,7 @@
       <w:r>
         <w:rPr>
           <w:b/>
+          <w:bCs/>
         </w:rPr>
         <w:t xml:space="preserve">precisa</w:t>
       </w:r>
@@ -1229,7 +1114,7 @@
         <w:rPr>
           <w:rStyle w:val="VerbatimChar"/>
         </w:rPr>
-        <w:t xml:space="preserve">/src/middlewares/  @alexandersilva</w:t>
+        <w:t xml:space="preserve">/src/middlewares/  @ScaTecnologia</w:t>
       </w:r>
       <w:r>
         <w:br/>
@@ -1238,7 +1123,7 @@
         <w:rPr>
           <w:rStyle w:val="VerbatimChar"/>
         </w:rPr>
-        <w:t xml:space="preserve">/src/routes/auth.js @alexandersilva</w:t>
+        <w:t xml:space="preserve">/src/routes/auth.js @ScaTecnologia</w:t>
       </w:r>
       <w:r>
         <w:br/>
@@ -1259,7 +1144,7 @@
         <w:rPr>
           <w:rStyle w:val="VerbatimChar"/>
         </w:rPr>
-        <w:t xml:space="preserve">/.github/  @alexandersilva</w:t>
+        <w:t xml:space="preserve">/.github/  @ScaTecnologia</w:t>
       </w:r>
       <w:r>
         <w:br/>
@@ -1268,7 +1153,7 @@
         <w:rPr>
           <w:rStyle w:val="VerbatimChar"/>
         </w:rPr>
-        <w:t xml:space="preserve">/Dockerfile* @alexandersilva</w:t>
+        <w:t xml:space="preserve">/Dockerfile* @ScaTecnologia</w:t>
       </w:r>
       <w:r>
         <w:br/>
@@ -1277,7 +1162,7 @@
         <w:rPr>
           <w:rStyle w:val="VerbatimChar"/>
         </w:rPr>
-        <w:t xml:space="preserve">/docker-compose.yml @alexandersilva</w:t>
+        <w:t xml:space="preserve">/docker-compose.yml @ScaTecnologia</w:t>
       </w:r>
     </w:p>
     <w:p>
@@ -1293,6 +1178,7 @@
       <w:r>
         <w:rPr>
           <w:b/>
+          <w:bCs/>
         </w:rPr>
         <w:t xml:space="preserve">exige</w:t>
       </w:r>
@@ -1303,15 +1189,15 @@
         <w:t xml:space="preserve">a revisão da pessoa/time listado antes de permitir o merge.</w:t>
       </w:r>
     </w:p>
+    <w:bookmarkEnd w:id="16"/>
+    <w:bookmarkStart w:id="17" w:name="Xf04ed86ac02de6355235fdcfaaade82b31d6c11"/>
     <w:p>
       <w:pPr>
         <w:pStyle w:val="Heading3"/>
       </w:pPr>
-      <w:bookmarkStart w:id="30" w:name="a-esteira-roda-para-cada-pr-isolada"/>
       <w:r>
         <w:t xml:space="preserve">3.3 A esteira roda para cada PR, isolada</w:t>
       </w:r>
-      <w:bookmarkEnd w:id="30"/>
     </w:p>
     <w:p>
       <w:pPr>
@@ -1341,6 +1227,7 @@
       <w:r>
         <w:rPr>
           <w:b/>
+          <w:bCs/>
         </w:rPr>
         <w:t xml:space="preserve">na branch daquele PR</w:t>
       </w:r>
@@ -1360,15 +1247,15 @@
         <w:t xml:space="preserve">, um de cada vez. A esteira nunca mistura o código de duas PRs diferentes.</w:t>
       </w:r>
     </w:p>
+    <w:bookmarkEnd w:id="17"/>
+    <w:bookmarkStart w:id="18" w:name="Xceb72a72735513e7b1f0e5451e41430efe3fb3b"/>
     <w:p>
       <w:pPr>
         <w:pStyle w:val="Heading3"/>
       </w:pPr>
-      <w:bookmarkStart w:id="31" w:name="Xe161cf9b8dc9b40f2aae298b8d8f700e7d35659"/>
       <w:r>
         <w:t xml:space="preserve">3.4 Pull Request template — dar contexto para quem revisa</w:t>
       </w:r>
-      <w:bookmarkEnd w:id="31"/>
     </w:p>
     <w:p>
       <w:pPr>
@@ -1384,22 +1271,7 @@
         <w:t xml:space="preserve"> </w:t>
       </w:r>
       <w:r>
-        <w:t xml:space="preserve">(criado neste laboratório) padroniza o que todo PR deve informar: o que mudou, qual issue resolve, como testar, se afeta segurança. Isso acelera a revisão e reduz aprovações</w:t>
-      </w:r>
-      <w:r>
-        <w:t xml:space="preserve"> </w:t>
-      </w:r>
-      <w:r>
-        <w:t xml:space="preserve">“</w:t>
-      </w:r>
-      <w:r>
-        <w:t xml:space="preserve">no escuro</w:t>
-      </w:r>
-      <w:r>
-        <w:t xml:space="preserve">”</w:t>
-      </w:r>
-      <w:r>
-        <w:t xml:space="preserve">.</w:t>
+        <w:t xml:space="preserve">(criado neste laboratório) padroniza o que todo PR deve informar: o que mudou, qual issue resolve, como testar, se afeta segurança. Isso acelera a revisão e reduz aprovações "no escuro".</w:t>
       </w:r>
     </w:p>
     <w:p>
@@ -1409,25 +1281,25 @@
         </w:pict>
       </w:r>
     </w:p>
+    <w:bookmarkEnd w:id="18"/>
+    <w:bookmarkEnd w:id="19"/>
+    <w:bookmarkStart w:id="25" w:name="Xa360c06a20fc0cf56b2175eb4f9b8121e6f4506"/>
     <w:p>
       <w:pPr>
         <w:pStyle w:val="Heading2"/>
       </w:pPr>
-      <w:bookmarkStart w:id="32" w:name="X2a9769b2024bef4e8ddf8e8f11867f32312a32e"/>
       <w:r>
         <w:t xml:space="preserve">4. Reconciliação — o que é, na prática, um conflito de merge</w:t>
       </w:r>
-      <w:bookmarkEnd w:id="32"/>
-    </w:p>
+    </w:p>
+    <w:bookmarkStart w:id="20" w:name="Xb477a0c961a780d8c4abb324fa19518700de84a"/>
     <w:p>
       <w:pPr>
         <w:pStyle w:val="Heading3"/>
       </w:pPr>
-      <w:bookmarkStart w:id="33" w:name="quando-ele-acontece"/>
       <w:r>
         <w:t xml:space="preserve">4.1 Quando ele acontece</w:t>
       </w:r>
-      <w:bookmarkEnd w:id="33"/>
     </w:p>
     <w:p>
       <w:pPr>
@@ -1442,6 +1314,7 @@
       <w:r>
         <w:rPr>
           <w:b/>
+          <w:bCs/>
         </w:rPr>
         <w:t xml:space="preserve">duas branches alteram a(s) mesma(s) linha(s) do mesmo arquivo</w:t>
       </w:r>
@@ -1454,269 +1327,274 @@
     </w:p>
     <w:p>
       <w:pPr>
+        <w:pStyle w:val="Compact"/>
         <w:numPr>
           <w:ilvl w:val="0"/>
           <w:numId w:val="1002"/>
         </w:numPr>
+      </w:pPr>
+      <w:r>
+        <w:t xml:space="preserve">Ele</w:t>
+      </w:r>
+      <w:r>
+        <w:t xml:space="preserve"> </w:t>
+      </w:r>
+      <w:r>
+        <w:rPr>
+          <w:b/>
+          <w:bCs/>
+        </w:rPr>
+        <w:t xml:space="preserve">não escolhe</w:t>
+      </w:r>
+      <w:r>
+        <w:t xml:space="preserve"> </w:t>
+      </w:r>
+      <w:r>
+        <w:t xml:space="preserve">uma versão e descarta a outra.</w:t>
+      </w:r>
+    </w:p>
+    <w:p>
+      <w:pPr>
         <w:pStyle w:val="Compact"/>
-      </w:pPr>
-      <w:r>
-        <w:t xml:space="preserve">Ele</w:t>
-      </w:r>
-      <w:r>
-        <w:t xml:space="preserve"> </w:t>
-      </w:r>
-      <w:r>
-        <w:rPr>
-          <w:b/>
-        </w:rPr>
-        <w:t xml:space="preserve">não escolhe</w:t>
-      </w:r>
-      <w:r>
-        <w:t xml:space="preserve"> </w:t>
-      </w:r>
-      <w:r>
-        <w:t xml:space="preserve">uma versão e descarta a outra.</w:t>
-      </w:r>
-    </w:p>
-    <w:p>
-      <w:pPr>
         <w:numPr>
           <w:ilvl w:val="0"/>
           <w:numId w:val="1002"/>
         </w:numPr>
+      </w:pPr>
+      <w:r>
+        <w:t xml:space="preserve">Ele</w:t>
+      </w:r>
+      <w:r>
+        <w:t xml:space="preserve"> </w:t>
+      </w:r>
+      <w:r>
+        <w:rPr>
+          <w:b/>
+          <w:bCs/>
+        </w:rPr>
+        <w:t xml:space="preserve">não apaga</w:t>
+      </w:r>
+      <w:r>
+        <w:t xml:space="preserve"> </w:t>
+      </w:r>
+      <w:r>
+        <w:t xml:space="preserve">o trabalho de ninguém.</w:t>
+      </w:r>
+    </w:p>
+    <w:p>
+      <w:pPr>
         <w:pStyle w:val="Compact"/>
-      </w:pPr>
-      <w:r>
-        <w:t xml:space="preserve">Ele</w:t>
-      </w:r>
-      <w:r>
-        <w:t xml:space="preserve"> </w:t>
-      </w:r>
-      <w:r>
-        <w:rPr>
-          <w:b/>
-        </w:rPr>
-        <w:t xml:space="preserve">não apaga</w:t>
-      </w:r>
-      <w:r>
-        <w:t xml:space="preserve"> </w:t>
-      </w:r>
-      <w:r>
-        <w:t xml:space="preserve">o trabalho de ninguém.</w:t>
-      </w:r>
-    </w:p>
-    <w:p>
-      <w:pPr>
         <w:numPr>
           <w:ilvl w:val="0"/>
           <w:numId w:val="1002"/>
         </w:numPr>
+      </w:pPr>
+      <w:r>
+        <w:t xml:space="preserve">Ele</w:t>
+      </w:r>
+      <w:r>
+        <w:t xml:space="preserve"> </w:t>
+      </w:r>
+      <w:r>
+        <w:rPr>
+          <w:b/>
+          <w:bCs/>
+        </w:rPr>
+        <w:t xml:space="preserve">para</w:t>
+      </w:r>
+      <w:r>
+        <w:t xml:space="preserve"> </w:t>
+      </w:r>
+      <w:r>
+        <w:t xml:space="preserve">o merge/rebase e marca o(s) arquivo(s) em conflito, esperando uma decisão humana.</w:t>
+      </w:r>
+    </w:p>
+    <w:p>
+      <w:pPr>
+        <w:pStyle w:val="FirstParagraph"/>
+      </w:pPr>
+      <w:r>
+        <w:t xml:space="preserve">Se as duas pessoas alteraram</w:t>
+      </w:r>
+      <w:r>
+        <w:t xml:space="preserve"> </w:t>
+      </w:r>
+      <w:r>
+        <w:rPr>
+          <w:b/>
+          <w:bCs/>
+        </w:rPr>
+        <w:t xml:space="preserve">arquivos diferentes</w:t>
+      </w:r>
+      <w:r>
+        <w:t xml:space="preserve">, ou</w:t>
+      </w:r>
+      <w:r>
+        <w:t xml:space="preserve"> </w:t>
+      </w:r>
+      <w:r>
+        <w:rPr>
+          <w:b/>
+          <w:bCs/>
+        </w:rPr>
+        <w:t xml:space="preserve">partes diferentes do mesmo arquivo</w:t>
+      </w:r>
+      <w:r>
+        <w:t xml:space="preserve"> </w:t>
+      </w:r>
+      <w:r>
+        <w:t xml:space="preserve">(linhas distantes), o Git resolve sozinho — a maioria das mudanças do dia a dia se encaixa nesse caso e nunca vira conflito visível.</w:t>
+      </w:r>
+    </w:p>
+    <w:bookmarkEnd w:id="20"/>
+    <w:bookmarkStart w:id="21" w:name="X71d5a766cb9b6e487a535d867b960b098fa7665"/>
+    <w:p>
+      <w:pPr>
+        <w:pStyle w:val="Heading3"/>
+      </w:pPr>
+      <w:r>
+        <w:t xml:space="preserve">4.2 Como o conflito aparece</w:t>
+      </w:r>
+    </w:p>
+    <w:p>
+      <w:pPr>
+        <w:pStyle w:val="SourceCode"/>
+      </w:pPr>
+      <w:r>
+        <w:rPr>
+          <w:rStyle w:val="FunctionTok"/>
+        </w:rPr>
+        <w:t xml:space="preserve">git</w:t>
+      </w:r>
+      <w:r>
+        <w:rPr>
+          <w:rStyle w:val="NormalTok"/>
+        </w:rPr>
+        <w:t xml:space="preserve"> rebase origin/main</w:t>
+      </w:r>
+      <w:r>
+        <w:br/>
+      </w:r>
+      <w:r>
+        <w:rPr>
+          <w:rStyle w:val="CommentTok"/>
+        </w:rPr>
+        <w:t xml:space="preserve"># ...</w:t>
+      </w:r>
+      <w:r>
+        <w:br/>
+      </w:r>
+      <w:r>
+        <w:rPr>
+          <w:rStyle w:val="CommentTok"/>
+        </w:rPr>
+        <w:t xml:space="preserve"># CONFLICT (content): Merge conflict in src/clientes.js</w:t>
+      </w:r>
+    </w:p>
+    <w:p>
+      <w:pPr>
+        <w:pStyle w:val="FirstParagraph"/>
+      </w:pPr>
+      <w:r>
+        <w:t xml:space="preserve">O arquivo em conflito passa a conter marcadores especiais:</w:t>
+      </w:r>
+    </w:p>
+    <w:p>
+      <w:pPr>
+        <w:pStyle w:val="SourceCode"/>
+      </w:pPr>
+      <w:r>
+        <w:rPr>
+          <w:rStyle w:val="VerbatimChar"/>
+        </w:rPr>
+        <w:t xml:space="preserve">&lt;&lt;&lt;&lt;&lt;&lt;&lt; HEAD</w:t>
+      </w:r>
+      <w:r>
+        <w:br/>
+      </w:r>
+      <w:r>
+        <w:rPr>
+          <w:rStyle w:val="VerbatimChar"/>
+        </w:rPr>
+        <w:t xml:space="preserve">    return `${cliente.nome} — ${cliente.cidade}`;</w:t>
+      </w:r>
+      <w:r>
+        <w:br/>
+      </w:r>
+      <w:r>
+        <w:rPr>
+          <w:rStyle w:val="VerbatimChar"/>
+        </w:rPr>
+        <w:t xml:space="preserve">=======</w:t>
+      </w:r>
+      <w:r>
+        <w:br/>
+      </w:r>
+      <w:r>
+        <w:rPr>
+          <w:rStyle w:val="VerbatimChar"/>
+        </w:rPr>
+        <w:t xml:space="preserve">    return `${cliente.nome} (${cliente.email})`;</w:t>
+      </w:r>
+      <w:r>
+        <w:br/>
+      </w:r>
+      <w:r>
+        <w:rPr>
+          <w:rStyle w:val="VerbatimChar"/>
+        </w:rPr>
+        <w:t xml:space="preserve">&gt;&gt;&gt;&gt;&gt;&gt;&gt; feature/123-corrigir-validacao-cnpj</w:t>
+      </w:r>
+    </w:p>
+    <w:p>
+      <w:pPr>
         <w:pStyle w:val="Compact"/>
-      </w:pPr>
-      <w:r>
-        <w:t xml:space="preserve">Ele</w:t>
-      </w:r>
-      <w:r>
-        <w:t xml:space="preserve"> </w:t>
-      </w:r>
-      <w:r>
-        <w:rPr>
-          <w:b/>
-        </w:rPr>
-        <w:t xml:space="preserve">para</w:t>
-      </w:r>
-      <w:r>
-        <w:t xml:space="preserve"> </w:t>
-      </w:r>
-      <w:r>
-        <w:t xml:space="preserve">o merge/rebase e marca o(s) arquivo(s) em conflito, esperando uma decisão humana.</w:t>
-      </w:r>
-    </w:p>
-    <w:p>
-      <w:pPr>
-        <w:pStyle w:val="FirstParagraph"/>
-      </w:pPr>
-      <w:r>
-        <w:t xml:space="preserve">Se as duas pessoas alteraram</w:t>
-      </w:r>
-      <w:r>
-        <w:t xml:space="preserve"> </w:t>
-      </w:r>
-      <w:r>
-        <w:rPr>
-          <w:b/>
-        </w:rPr>
-        <w:t xml:space="preserve">arquivos diferentes</w:t>
-      </w:r>
-      <w:r>
-        <w:t xml:space="preserve">, ou</w:t>
-      </w:r>
-      <w:r>
-        <w:t xml:space="preserve"> </w:t>
-      </w:r>
-      <w:r>
-        <w:rPr>
-          <w:b/>
-        </w:rPr>
-        <w:t xml:space="preserve">partes diferentes do mesmo arquivo</w:t>
-      </w:r>
-      <w:r>
-        <w:t xml:space="preserve"> </w:t>
-      </w:r>
-      <w:r>
-        <w:t xml:space="preserve">(linhas distantes), o Git resolve sozinho — a maioria das mudanças do dia a dia se encaixa nesse caso e nunca vira conflito visível.</w:t>
-      </w:r>
-    </w:p>
-    <w:p>
-      <w:pPr>
-        <w:pStyle w:val="Heading3"/>
-      </w:pPr>
-      <w:bookmarkStart w:id="34" w:name="como-o-conflito-aparece"/>
-      <w:r>
-        <w:t xml:space="preserve">4.2 Como o conflito aparece</w:t>
-      </w:r>
-      <w:bookmarkEnd w:id="34"/>
-    </w:p>
-    <w:p>
-      <w:pPr>
-        <w:pStyle w:val="SourceCode"/>
-      </w:pPr>
-      <w:r>
-        <w:rPr>
-          <w:rStyle w:val="FunctionTok"/>
-        </w:rPr>
-        <w:t xml:space="preserve">git</w:t>
-      </w:r>
-      <w:r>
-        <w:rPr>
-          <w:rStyle w:val="NormalTok"/>
-        </w:rPr>
-        <w:t xml:space="preserve"> rebase origin/main</w:t>
-      </w:r>
-      <w:r>
-        <w:br/>
-      </w:r>
-      <w:r>
-        <w:rPr>
-          <w:rStyle w:val="CommentTok"/>
-        </w:rPr>
-        <w:t xml:space="preserve"># ...</w:t>
-      </w:r>
-      <w:r>
-        <w:br/>
-      </w:r>
-      <w:r>
-        <w:rPr>
-          <w:rStyle w:val="CommentTok"/>
-        </w:rPr>
-        <w:t xml:space="preserve"># CONFLICT (content): Merge conflict in src/clientes.js</w:t>
-      </w:r>
-    </w:p>
-    <w:p>
-      <w:pPr>
-        <w:pStyle w:val="FirstParagraph"/>
-      </w:pPr>
-      <w:r>
-        <w:t xml:space="preserve">O arquivo em conflito passa a conter marcadores especiais:</w:t>
-      </w:r>
-    </w:p>
-    <w:p>
-      <w:pPr>
-        <w:pStyle w:val="SourceCode"/>
-      </w:pPr>
-      <w:r>
-        <w:rPr>
-          <w:rStyle w:val="VerbatimChar"/>
-        </w:rPr>
-        <w:t xml:space="preserve">&lt;&lt;&lt;&lt;&lt;&lt;&lt; HEAD</w:t>
-      </w:r>
-      <w:r>
-        <w:br/>
-      </w:r>
-      <w:r>
-        <w:rPr>
-          <w:rStyle w:val="VerbatimChar"/>
-        </w:rPr>
-        <w:t xml:space="preserve">    return `${cliente.nome} — ${cliente.cidade}`;</w:t>
-      </w:r>
-      <w:r>
-        <w:br/>
-      </w:r>
-      <w:r>
-        <w:rPr>
-          <w:rStyle w:val="VerbatimChar"/>
-        </w:rPr>
-        <w:t xml:space="preserve">=======</w:t>
-      </w:r>
-      <w:r>
-        <w:br/>
-      </w:r>
-      <w:r>
-        <w:rPr>
-          <w:rStyle w:val="VerbatimChar"/>
-        </w:rPr>
-        <w:t xml:space="preserve">    return `${cliente.nome} (${cliente.email})`;</w:t>
-      </w:r>
-      <w:r>
-        <w:br/>
-      </w:r>
-      <w:r>
-        <w:rPr>
-          <w:rStyle w:val="VerbatimChar"/>
-        </w:rPr>
-        <w:t xml:space="preserve">&gt;&gt;&gt;&gt;&gt;&gt;&gt; feature/123-corrigir-validacao-cnpj</w:t>
-      </w:r>
-    </w:p>
-    <w:p>
-      <w:pPr>
         <w:numPr>
           <w:ilvl w:val="0"/>
           <w:numId w:val="1003"/>
         </w:numPr>
+      </w:pPr>
+      <w:r>
+        <w:t xml:space="preserve">Tudo entre</w:t>
+      </w:r>
+      <w:r>
+        <w:t xml:space="preserve"> </w:t>
+      </w:r>
+      <w:r>
+        <w:rPr>
+          <w:rStyle w:val="VerbatimChar"/>
+        </w:rPr>
+        <w:t xml:space="preserve">&lt;&lt;&lt;&lt;&lt;&lt;&lt; HEAD</w:t>
+      </w:r>
+      <w:r>
+        <w:t xml:space="preserve"> </w:t>
+      </w:r>
+      <w:r>
+        <w:t xml:space="preserve">e</w:t>
+      </w:r>
+      <w:r>
+        <w:t xml:space="preserve"> </w:t>
+      </w:r>
+      <w:r>
+        <w:rPr>
+          <w:rStyle w:val="VerbatimChar"/>
+        </w:rPr>
+        <w:t xml:space="preserve">=======</w:t>
+      </w:r>
+      <w:r>
+        <w:t xml:space="preserve"> </w:t>
+      </w:r>
+      <w:r>
+        <w:t xml:space="preserve">é a versão que já estava na branch de destino.</w:t>
+      </w:r>
+    </w:p>
+    <w:p>
+      <w:pPr>
         <w:pStyle w:val="Compact"/>
-      </w:pPr>
-      <w:r>
-        <w:t xml:space="preserve">Tudo entre</w:t>
-      </w:r>
-      <w:r>
-        <w:t xml:space="preserve"> </w:t>
-      </w:r>
-      <w:r>
-        <w:rPr>
-          <w:rStyle w:val="VerbatimChar"/>
-        </w:rPr>
-        <w:t xml:space="preserve">&lt;&lt;&lt;&lt;&lt;&lt;&lt; HEAD</w:t>
-      </w:r>
-      <w:r>
-        <w:t xml:space="preserve"> </w:t>
-      </w:r>
-      <w:r>
-        <w:t xml:space="preserve">e</w:t>
-      </w:r>
-      <w:r>
-        <w:t xml:space="preserve"> </w:t>
-      </w:r>
-      <w:r>
-        <w:rPr>
-          <w:rStyle w:val="VerbatimChar"/>
-        </w:rPr>
-        <w:t xml:space="preserve">=======</w:t>
-      </w:r>
-      <w:r>
-        <w:t xml:space="preserve"> </w:t>
-      </w:r>
-      <w:r>
-        <w:t xml:space="preserve">é a versão que já estava na branch de destino.</w:t>
-      </w:r>
-    </w:p>
-    <w:p>
-      <w:pPr>
         <w:numPr>
           <w:ilvl w:val="0"/>
           <w:numId w:val="1003"/>
         </w:numPr>
-        <w:pStyle w:val="Compact"/>
       </w:pPr>
       <w:r>
         <w:t xml:space="preserve">Tudo entre</w:t>
@@ -1752,15 +1630,15 @@
         <w:t xml:space="preserve">é a versão que está chegando.</w:t>
       </w:r>
     </w:p>
+    <w:bookmarkEnd w:id="21"/>
+    <w:bookmarkStart w:id="22" w:name="Xc4b3557d299881bb00217b9a0903fff72bc6a70"/>
     <w:p>
       <w:pPr>
         <w:pStyle w:val="Heading3"/>
       </w:pPr>
-      <w:bookmarkStart w:id="35" w:name="como-resolver-passo-a-passo"/>
       <w:r>
         <w:t xml:space="preserve">4.3 Como resolver, passo a passo</w:t>
       </w:r>
-      <w:bookmarkEnd w:id="35"/>
     </w:p>
     <w:p>
       <w:pPr>
@@ -1871,11 +1749,11 @@
     </w:p>
     <w:p>
       <w:pPr>
+        <w:pStyle w:val="SourceCode"/>
         <w:numPr>
           <w:ilvl w:val="0"/>
           <w:numId w:val="1000"/>
         </w:numPr>
-        <w:pStyle w:val="SourceCode"/>
       </w:pPr>
       <w:r>
         <w:rPr>
@@ -1902,7 +1780,25 @@
         <w:rPr>
           <w:rStyle w:val="NormalTok"/>
         </w:rPr>
-        <w:t xml:space="preserve"> rebase --continue      # ou: git commit  (se estiver em um merge, não rebase)</w:t>
+        <w:t xml:space="preserve"> rebase </w:t>
+      </w:r>
+      <w:r>
+        <w:rPr>
+          <w:rStyle w:val="AttributeTok"/>
+        </w:rPr>
+        <w:t xml:space="preserve">--continue</w:t>
+      </w:r>
+      <w:r>
+        <w:rPr>
+          <w:rStyle w:val="NormalTok"/>
+        </w:rPr>
+        <w:t xml:space="preserve">      </w:t>
+      </w:r>
+      <w:r>
+        <w:rPr>
+          <w:rStyle w:val="CommentTok"/>
+        </w:rPr>
+        <w:t xml:space="preserve"># ou: git commit  (se estiver em um merge, não rebase)</w:t>
       </w:r>
     </w:p>
     <w:p>
@@ -1918,11 +1814,11 @@
     </w:p>
     <w:p>
       <w:pPr>
+        <w:pStyle w:val="SourceCode"/>
         <w:numPr>
           <w:ilvl w:val="0"/>
           <w:numId w:val="1000"/>
         </w:numPr>
-        <w:pStyle w:val="SourceCode"/>
       </w:pPr>
       <w:r>
         <w:rPr>
@@ -1934,16 +1830,34 @@
         <w:rPr>
           <w:rStyle w:val="NormalTok"/>
         </w:rPr>
-        <w:t xml:space="preserve"> push --force-with-lease   # necessário após rebase, pois reescreve os commits da SUA branch</w:t>
-      </w:r>
-    </w:p>
-    <w:p>
-      <w:pPr>
+        <w:t xml:space="preserve"> push </w:t>
+      </w:r>
+      <w:r>
+        <w:rPr>
+          <w:rStyle w:val="AttributeTok"/>
+        </w:rPr>
+        <w:t xml:space="preserve">--force-with-lease</w:t>
+      </w:r>
+      <w:r>
+        <w:rPr>
+          <w:rStyle w:val="NormalTok"/>
+        </w:rPr>
+        <w:t xml:space="preserve">   </w:t>
+      </w:r>
+      <w:r>
+        <w:rPr>
+          <w:rStyle w:val="CommentTok"/>
+        </w:rPr>
+        <w:t xml:space="preserve"># necessário após rebase, pois reescreve os commits da SUA branch</w:t>
+      </w:r>
+    </w:p>
+    <w:p>
+      <w:pPr>
+        <w:pStyle w:val="BlockText"/>
         <w:numPr>
           <w:ilvl w:val="0"/>
           <w:numId w:val="1000"/>
         </w:numPr>
-        <w:pStyle w:val="BlockText"/>
       </w:pPr>
       <w:r>
         <w:rPr>
@@ -1978,6 +1892,7 @@
       <w:r>
         <w:rPr>
           <w:b/>
+          <w:bCs/>
         </w:rPr>
         <w:t xml:space="preserve">sua própria branch de feature</w:t>
       </w:r>
@@ -2000,151 +1915,105 @@
         <w:t xml:space="preserve">— e ele recusa o push se alguém mais tiver alterado essa branch remota sem você saber, evitando sobrescrever trabalho alheio por engano.</w:t>
       </w:r>
     </w:p>
+    <w:bookmarkEnd w:id="22"/>
+    <w:bookmarkStart w:id="23" w:name="Xcf55a5b0e5626555477b574be4356e91212e0f5"/>
     <w:p>
       <w:pPr>
         <w:pStyle w:val="Heading3"/>
       </w:pPr>
-      <w:bookmarkStart w:id="36" w:name="Xfe43caff1023ec7a36db8b918ea4b2942e258a0"/>
-      <w:r>
-        <w:t xml:space="preserve">4.4 Por que isso não é</w:t>
-      </w:r>
-      <w:r>
-        <w:t xml:space="preserve"> </w:t>
-      </w:r>
-      <w:r>
-        <w:t xml:space="preserve">“</w:t>
-      </w:r>
-      <w:r>
-        <w:t xml:space="preserve">perder o trabalho de alguém</w:t>
-      </w:r>
-      <w:r>
-        <w:t xml:space="preserve">”</w:t>
-      </w:r>
-      <w:bookmarkEnd w:id="36"/>
+      <w:r>
+        <w:t xml:space="preserve">4.4 Por que isso não é "perder o trabalho de alguém"</w:t>
+      </w:r>
     </w:p>
     <w:p>
       <w:pPr>
         <w:pStyle w:val="FirstParagraph"/>
       </w:pPr>
       <w:r>
-        <w:t xml:space="preserve">O medo comum de quem está aprendendo é:</w:t>
-      </w:r>
-      <w:r>
-        <w:t xml:space="preserve"> </w:t>
-      </w:r>
-      <w:r>
-        <w:t xml:space="preserve">“</w:t>
-      </w:r>
-      <w:r>
-        <w:t xml:space="preserve">e se eu escolher errado e apagar o que o outro fez?</w:t>
-      </w:r>
-      <w:r>
-        <w:t xml:space="preserve">”</w:t>
-      </w:r>
-      <w:r>
-        <w:t xml:space="preserve"> </w:t>
-      </w:r>
-      <w:r>
-        <w:t xml:space="preserve">Na prática:</w:t>
-      </w:r>
-    </w:p>
-    <w:p>
-      <w:pPr>
+        <w:t xml:space="preserve">O medo comum de quem está aprendendo é: "e se eu escolher errado e apagar o que o outro fez?" Na prática:</w:t>
+      </w:r>
+    </w:p>
+    <w:p>
+      <w:pPr>
+        <w:pStyle w:val="Compact"/>
         <w:numPr>
           <w:ilvl w:val="0"/>
           <w:numId w:val="1005"/>
         </w:numPr>
+      </w:pPr>
+      <w:r>
+        <w:t xml:space="preserve">O commit original de cada pessoa</w:t>
+      </w:r>
+      <w:r>
+        <w:t xml:space="preserve"> </w:t>
+      </w:r>
+      <w:r>
+        <w:rPr>
+          <w:b/>
+          <w:bCs/>
+        </w:rPr>
+        <w:t xml:space="preserve">continua existindo no histórico do Git</w:t>
+      </w:r>
+      <w:r>
+        <w:t xml:space="preserve"> </w:t>
+      </w:r>
+      <w:r>
+        <w:t xml:space="preserve">(</w:t>
+      </w:r>
+      <w:r>
+        <w:rPr>
+          <w:rStyle w:val="VerbatimChar"/>
+        </w:rPr>
+        <w:t xml:space="preserve">git log</w:t>
+      </w:r>
+      <w:r>
+        <w:t xml:space="preserve">,</w:t>
+      </w:r>
+      <w:r>
+        <w:t xml:space="preserve"> </w:t>
+      </w:r>
+      <w:r>
+        <w:rPr>
+          <w:rStyle w:val="VerbatimChar"/>
+        </w:rPr>
+        <w:t xml:space="preserve">git reflog</w:t>
+      </w:r>
+      <w:r>
+        <w:t xml:space="preserve">) mesmo depois de um conflito resolvido "errado" — nada é destruído de verdade, dá para recuperar.</w:t>
+      </w:r>
+    </w:p>
+    <w:p>
+      <w:pPr>
         <w:pStyle w:val="Compact"/>
-      </w:pPr>
-      <w:r>
-        <w:t xml:space="preserve">O commit original de cada pessoa</w:t>
-      </w:r>
-      <w:r>
-        <w:t xml:space="preserve"> </w:t>
-      </w:r>
-      <w:r>
-        <w:rPr>
-          <w:b/>
-        </w:rPr>
-        <w:t xml:space="preserve">continua existindo no histórico do Git</w:t>
-      </w:r>
-      <w:r>
-        <w:t xml:space="preserve"> </w:t>
-      </w:r>
-      <w:r>
-        <w:t xml:space="preserve">(</w:t>
-      </w:r>
-      <w:r>
-        <w:rPr>
-          <w:rStyle w:val="VerbatimChar"/>
-        </w:rPr>
-        <w:t xml:space="preserve">git log</w:t>
-      </w:r>
-      <w:r>
-        <w:t xml:space="preserve">,</w:t>
-      </w:r>
-      <w:r>
-        <w:t xml:space="preserve"> </w:t>
-      </w:r>
-      <w:r>
-        <w:rPr>
-          <w:rStyle w:val="VerbatimChar"/>
-        </w:rPr>
-        <w:t xml:space="preserve">git reflog</w:t>
-      </w:r>
-      <w:r>
-        <w:t xml:space="preserve">) mesmo depois de um conflito resolvido</w:t>
-      </w:r>
-      <w:r>
-        <w:t xml:space="preserve"> </w:t>
-      </w:r>
-      <w:r>
-        <w:t xml:space="preserve">“</w:t>
-      </w:r>
-      <w:r>
-        <w:t xml:space="preserve">errado</w:t>
-      </w:r>
-      <w:r>
-        <w:t xml:space="preserve">”</w:t>
-      </w:r>
-      <w:r>
-        <w:t xml:space="preserve"> </w:t>
-      </w:r>
-      <w:r>
-        <w:t xml:space="preserve">— nada é destruído de verdade, dá para recuperar.</w:t>
-      </w:r>
-    </w:p>
-    <w:p>
-      <w:pPr>
         <w:numPr>
           <w:ilvl w:val="0"/>
           <w:numId w:val="1005"/>
         </w:numPr>
+      </w:pPr>
+      <w:r>
+        <w:t xml:space="preserve">A resolução do conflito é</w:t>
+      </w:r>
+      <w:r>
+        <w:t xml:space="preserve"> </w:t>
+      </w:r>
+      <w:r>
+        <w:rPr>
+          <w:b/>
+          <w:bCs/>
+        </w:rPr>
+        <w:t xml:space="preserve">um novo commit revisável</w:t>
+      </w:r>
+      <w:r>
+        <w:t xml:space="preserve">: ele aparece no PR como qualquer outra mudança, e o CODEOWNERS/revisor pode notar se algo foi perdido por engano.</w:t>
+      </w:r>
+    </w:p>
+    <w:p>
+      <w:pPr>
         <w:pStyle w:val="Compact"/>
-      </w:pPr>
-      <w:r>
-        <w:t xml:space="preserve">A resolução do conflito é</w:t>
-      </w:r>
-      <w:r>
-        <w:t xml:space="preserve"> </w:t>
-      </w:r>
-      <w:r>
-        <w:rPr>
-          <w:b/>
-        </w:rPr>
-        <w:t xml:space="preserve">um novo commit revisável</w:t>
-      </w:r>
-      <w:r>
-        <w:t xml:space="preserve">: ele aparece no PR como qualquer outra mudança, e o CODEOWNERS/revisor pode notar se algo foi perdido por engano.</w:t>
-      </w:r>
-    </w:p>
-    <w:p>
-      <w:pPr>
         <w:numPr>
           <w:ilvl w:val="0"/>
           <w:numId w:val="1005"/>
         </w:numPr>
-        <w:pStyle w:val="Compact"/>
       </w:pPr>
       <w:r>
         <w:t xml:space="preserve">A esteira (</w:t>
@@ -2164,6 +2033,7 @@
       <w:r>
         <w:rPr>
           <w:b/>
+          <w:bCs/>
         </w:rPr>
         <w:t xml:space="preserve">antes</w:t>
       </w:r>
@@ -2174,21 +2044,21 @@
         <w:t xml:space="preserve">de chegar em produção, não depois.</w:t>
       </w:r>
     </w:p>
+    <w:bookmarkEnd w:id="23"/>
+    <w:bookmarkStart w:id="24" w:name="Xf8708ae6b81860a33ffd4861838231aeb021c77"/>
     <w:p>
       <w:pPr>
         <w:pStyle w:val="Heading3"/>
       </w:pPr>
-      <w:bookmarkStart w:id="37" w:name="X6a163cdaefe20af4452dbe96153037fa27a37fe"/>
       <w:r>
         <w:t xml:space="preserve">4.5 Práticas que reduzem a frequência de conflitos</w:t>
       </w:r>
-      <w:bookmarkEnd w:id="37"/>
     </w:p>
     <w:tbl>
       <w:tblPr>
         <w:tblStyle w:val="Table"/>
-        <w:tblW w:type="pct" w:w="5000.0"/>
-        <w:tblLook w:firstRow="1"/>
+        <w:tblW w:type="auto" w:w="0"/>
+        <w:tblLook w:firstRow="1" w:lastRow="0" w:firstColumn="0" w:lastColumn="0" w:noHBand="0" w:noVBand="0" w:val="0020"/>
       </w:tblPr>
       <w:tblGrid>
         <w:gridCol w:w="3960"/>
@@ -2196,19 +2066,13 @@
       </w:tblGrid>
       <w:tr>
         <w:trPr>
-          <w:cnfStyle w:firstRow="1"/>
+          <w:tblHeader w:val="on"/>
         </w:trPr>
         <w:tc>
-          <w:tcPr>
-            <w:tcBorders>
-              <w:bottom w:val="single"/>
-            </w:tcBorders>
-            <w:vAlign w:val="bottom"/>
-          </w:tcPr>
+          <w:tcPr/>
           <w:p>
             <w:pPr>
               <w:pStyle w:val="Compact"/>
-              <w:jc w:val="left"/>
             </w:pPr>
             <w:r>
               <w:t xml:space="preserve">Prática</w:t>
@@ -2216,16 +2080,10 @@
           </w:p>
         </w:tc>
         <w:tc>
-          <w:tcPr>
-            <w:tcBorders>
-              <w:bottom w:val="single"/>
-            </w:tcBorders>
-            <w:vAlign w:val="bottom"/>
-          </w:tcPr>
+          <w:tcPr/>
           <w:p>
             <w:pPr>
               <w:pStyle w:val="Compact"/>
-              <w:jc w:val="left"/>
             </w:pPr>
             <w:r>
               <w:t xml:space="preserve">Efeito</w:t>
@@ -2235,10 +2093,10 @@
       </w:tr>
       <w:tr>
         <w:tc>
+          <w:tcPr/>
           <w:p>
             <w:pPr>
               <w:pStyle w:val="Compact"/>
-              <w:jc w:val="left"/>
             </w:pPr>
             <w:r>
               <w:t xml:space="preserve">Branches curtas (seção 2.3)</w:t>
@@ -2246,10 +2104,10 @@
           </w:p>
         </w:tc>
         <w:tc>
+          <w:tcPr/>
           <w:p>
             <w:pPr>
               <w:pStyle w:val="Compact"/>
-              <w:jc w:val="left"/>
             </w:pPr>
             <w:r>
               <w:t xml:space="preserve">Menos tempo para divergir</w:t>
@@ -2259,10 +2117,10 @@
       </w:tr>
       <w:tr>
         <w:tc>
+          <w:tcPr/>
           <w:p>
             <w:pPr>
               <w:pStyle w:val="Compact"/>
-              <w:jc w:val="left"/>
             </w:pPr>
             <w:r>
               <w:t xml:space="preserve">Tarefas bem fatiadas no backlog (arquivos/módulos diferentes por tarefa)</w:t>
@@ -2270,10 +2128,10 @@
           </w:p>
         </w:tc>
         <w:tc>
+          <w:tcPr/>
           <w:p>
             <w:pPr>
               <w:pStyle w:val="Compact"/>
-              <w:jc w:val="left"/>
             </w:pPr>
             <w:r>
               <w:t xml:space="preserve">Menos gente mexendo no mesmo arquivo ao mesmo tempo</w:t>
@@ -2283,10 +2141,10 @@
       </w:tr>
       <w:tr>
         <w:tc>
+          <w:tcPr/>
           <w:p>
             <w:pPr>
               <w:pStyle w:val="Compact"/>
-              <w:jc w:val="left"/>
             </w:pPr>
             <w:r>
               <w:rPr>
@@ -2321,10 +2179,10 @@
           </w:p>
         </w:tc>
         <w:tc>
+          <w:tcPr/>
           <w:p>
             <w:pPr>
               <w:pStyle w:val="Compact"/>
-              <w:jc w:val="left"/>
             </w:pPr>
             <w:r>
               <w:t xml:space="preserve">Conflitos pequenos e cedo, não um grande no fim</w:t>
@@ -2334,36 +2192,21 @@
       </w:tr>
       <w:tr>
         <w:tc>
+          <w:tcPr/>
           <w:p>
             <w:pPr>
               <w:pStyle w:val="Compact"/>
-              <w:jc w:val="left"/>
             </w:pPr>
             <w:r>
-              <w:t xml:space="preserve">Funções pequenas e coesas (menos</w:t>
-            </w:r>
-            <w:r>
-              <w:t xml:space="preserve"> </w:t>
-            </w:r>
-            <w:r>
-              <w:t xml:space="preserve">“</w:t>
-            </w:r>
-            <w:r>
-              <w:t xml:space="preserve">arquivos gigantes que todo mundo precisa tocar</w:t>
-            </w:r>
-            <w:r>
-              <w:t xml:space="preserve">”</w:t>
-            </w:r>
-            <w:r>
-              <w:t xml:space="preserve">)</w:t>
+              <w:t xml:space="preserve">Funções pequenas e coesas (menos "arquivos gigantes que todo mundo precisa tocar")</w:t>
             </w:r>
           </w:p>
         </w:tc>
         <w:tc>
+          <w:tcPr/>
           <w:p>
             <w:pPr>
               <w:pStyle w:val="Compact"/>
-              <w:jc w:val="left"/>
             </w:pPr>
             <w:r>
               <w:t xml:space="preserve">Menos colisão de linha</w:t>
@@ -2373,19 +2216,13 @@
       </w:tr>
       <w:tr>
         <w:tc>
+          <w:tcPr/>
           <w:p>
             <w:pPr>
               <w:pStyle w:val="Compact"/>
-              <w:jc w:val="left"/>
             </w:pPr>
             <w:r>
-              <w:t xml:space="preserve">Comunicação simples (</w:t>
-            </w:r>
-            <w:r>
-              <w:t xml:space="preserve">“</w:t>
-            </w:r>
-            <w:r>
-              <w:t xml:space="preserve">vou mexer em</w:t>
+              <w:t xml:space="preserve">Comunicação simples ("vou mexer em</w:t>
             </w:r>
             <w:r>
               <w:t xml:space="preserve"> </w:t>
@@ -2400,21 +2237,15 @@
               <w:t xml:space="preserve"> </w:t>
             </w:r>
             <w:r>
-              <w:t xml:space="preserve">hoje</w:t>
-            </w:r>
-            <w:r>
-              <w:t xml:space="preserve">”</w:t>
-            </w:r>
-            <w:r>
-              <w:t xml:space="preserve">, no canal da equipe)</w:t>
+              <w:t xml:space="preserve">hoje", no canal da equipe)</w:t>
             </w:r>
           </w:p>
         </w:tc>
         <w:tc>
+          <w:tcPr/>
           <w:p>
             <w:pPr>
               <w:pStyle w:val="Compact"/>
-              <w:jc w:val="left"/>
             </w:pPr>
             <w:r>
               <w:t xml:space="preserve">Complementa o Git, não substitui — combina bem com o board Kanban visível para todos</w:t>
@@ -2430,15 +2261,16 @@
         </w:pict>
       </w:r>
     </w:p>
+    <w:bookmarkEnd w:id="24"/>
+    <w:bookmarkEnd w:id="25"/>
+    <w:bookmarkStart w:id="26" w:name="Xa32761b662479ae18060513aa4dd9ff404f2e3d"/>
     <w:p>
       <w:pPr>
         <w:pStyle w:val="Heading2"/>
       </w:pPr>
-      <w:bookmarkStart w:id="38" w:name="o-caminho-completo-do-backlog-à-produção"/>
       <w:r>
         <w:t xml:space="preserve">5. O caminho completo: do backlog à produção</w:t>
       </w:r>
-      <w:bookmarkEnd w:id="38"/>
     </w:p>
     <w:p>
       <w:pPr>
@@ -2615,8 +2447,8 @@
     <w:tbl>
       <w:tblPr>
         <w:tblStyle w:val="Table"/>
-        <w:tblW w:type="pct" w:w="5000.0"/>
-        <w:tblLook w:firstRow="1"/>
+        <w:tblW w:type="auto" w:w="0"/>
+        <w:tblLook w:firstRow="1" w:lastRow="0" w:firstColumn="0" w:lastColumn="0" w:noHBand="0" w:noVBand="0" w:val="0020"/>
       </w:tblPr>
       <w:tblGrid>
         <w:gridCol w:w="3960"/>
@@ -2624,19 +2456,13 @@
       </w:tblGrid>
       <w:tr>
         <w:trPr>
-          <w:cnfStyle w:firstRow="1"/>
+          <w:tblHeader w:val="on"/>
         </w:trPr>
         <w:tc>
-          <w:tcPr>
-            <w:tcBorders>
-              <w:bottom w:val="single"/>
-            </w:tcBorders>
-            <w:vAlign w:val="bottom"/>
-          </w:tcPr>
+          <w:tcPr/>
           <w:p>
             <w:pPr>
               <w:pStyle w:val="Compact"/>
-              <w:jc w:val="left"/>
             </w:pPr>
             <w:r>
               <w:t xml:space="preserve">Etapa</w:t>
@@ -2644,16 +2470,10 @@
           </w:p>
         </w:tc>
         <w:tc>
-          <w:tcPr>
-            <w:tcBorders>
-              <w:bottom w:val="single"/>
-            </w:tcBorders>
-            <w:vAlign w:val="bottom"/>
-          </w:tcPr>
+          <w:tcPr/>
           <w:p>
             <w:pPr>
               <w:pStyle w:val="Compact"/>
-              <w:jc w:val="left"/>
             </w:pPr>
             <w:r>
               <w:t xml:space="preserve">Onde está</w:t>
@@ -2663,10 +2483,10 @@
       </w:tr>
       <w:tr>
         <w:tc>
+          <w:tcPr/>
           <w:p>
             <w:pPr>
               <w:pStyle w:val="Compact"/>
-              <w:jc w:val="left"/>
             </w:pPr>
             <w:r>
               <w:t xml:space="preserve">Backlog</w:t>
@@ -2674,10 +2494,10 @@
           </w:p>
         </w:tc>
         <w:tc>
+          <w:tcPr/>
           <w:p>
             <w:pPr>
               <w:pStyle w:val="Compact"/>
-              <w:jc w:val="left"/>
             </w:pPr>
             <w:r>
               <w:rPr>
@@ -2705,10 +2525,10 @@
       </w:tr>
       <w:tr>
         <w:tc>
+          <w:tcPr/>
           <w:p>
             <w:pPr>
               <w:pStyle w:val="Compact"/>
-              <w:jc w:val="left"/>
             </w:pPr>
             <w:r>
               <w:t xml:space="preserve">Branch isolada</w:t>
@@ -2716,10 +2536,10 @@
           </w:p>
         </w:tc>
         <w:tc>
+          <w:tcPr/>
           <w:p>
             <w:pPr>
               <w:pStyle w:val="Compact"/>
-              <w:jc w:val="left"/>
             </w:pPr>
             <w:r>
               <w:t xml:space="preserve">Convenção da seção 2.2 deste documento</w:t>
@@ -2729,10 +2549,10 @@
       </w:tr>
       <w:tr>
         <w:tc>
+          <w:tcPr/>
           <w:p>
             <w:pPr>
               <w:pStyle w:val="Compact"/>
-              <w:jc w:val="left"/>
             </w:pPr>
             <w:r>
               <w:t xml:space="preserve">Pull Request + CI</w:t>
@@ -2740,10 +2560,10 @@
           </w:p>
         </w:tc>
         <w:tc>
+          <w:tcPr/>
           <w:p>
             <w:pPr>
               <w:pStyle w:val="Compact"/>
-              <w:jc w:val="left"/>
             </w:pPr>
             <w:r>
               <w:rPr>
@@ -2771,10 +2591,10 @@
       </w:tr>
       <w:tr>
         <w:tc>
+          <w:tcPr/>
           <w:p>
             <w:pPr>
               <w:pStyle w:val="Compact"/>
-              <w:jc w:val="left"/>
             </w:pPr>
             <w:r>
               <w:t xml:space="preserve">Revisão obrigatória</w:t>
@@ -2782,10 +2602,10 @@
           </w:p>
         </w:tc>
         <w:tc>
+          <w:tcPr/>
           <w:p>
             <w:pPr>
               <w:pStyle w:val="Compact"/>
-              <w:jc w:val="left"/>
             </w:pPr>
             <w:r>
               <w:rPr>
@@ -2804,10 +2624,10 @@
       </w:tr>
       <w:tr>
         <w:tc>
+          <w:tcPr/>
           <w:p>
             <w:pPr>
               <w:pStyle w:val="Compact"/>
-              <w:jc w:val="left"/>
             </w:pPr>
             <w:r>
               <w:t xml:space="preserve">Deploy com aprovação</w:t>
@@ -2815,10 +2635,10 @@
           </w:p>
         </w:tc>
         <w:tc>
+          <w:tcPr/>
           <w:p>
             <w:pPr>
               <w:pStyle w:val="Compact"/>
-              <w:jc w:val="left"/>
             </w:pPr>
             <w:r>
               <w:rPr>
@@ -2887,25 +2707,25 @@
         </w:pict>
       </w:r>
     </w:p>
+    <w:bookmarkEnd w:id="26"/>
+    <w:bookmarkStart w:id="33" w:name="referências"/>
     <w:p>
       <w:pPr>
         <w:pStyle w:val="Heading2"/>
       </w:pPr>
-      <w:bookmarkStart w:id="39" w:name="referências"/>
       <w:r>
         <w:t xml:space="preserve">Referências</w:t>
       </w:r>
-      <w:bookmarkEnd w:id="39"/>
-    </w:p>
-    <w:p>
-      <w:pPr>
+    </w:p>
+    <w:p>
+      <w:pPr>
+        <w:pStyle w:val="Compact"/>
         <w:numPr>
           <w:ilvl w:val="0"/>
           <w:numId w:val="1006"/>
         </w:numPr>
-        <w:pStyle w:val="Compact"/>
-      </w:pPr>
-      <w:hyperlink r:id="rId40">
+      </w:pPr>
+      <w:hyperlink r:id="rId27">
         <w:r>
           <w:rPr>
             <w:rStyle w:val="Hyperlink"/>
@@ -2916,13 +2736,13 @@
     </w:p>
     <w:p>
       <w:pPr>
+        <w:pStyle w:val="Compact"/>
         <w:numPr>
           <w:ilvl w:val="0"/>
           <w:numId w:val="1006"/>
         </w:numPr>
-        <w:pStyle w:val="Compact"/>
-      </w:pPr>
-      <w:hyperlink r:id="rId41">
+      </w:pPr>
+      <w:hyperlink r:id="rId28">
         <w:r>
           <w:rPr>
             <w:rStyle w:val="Hyperlink"/>
@@ -2933,13 +2753,13 @@
     </w:p>
     <w:p>
       <w:pPr>
+        <w:pStyle w:val="Compact"/>
         <w:numPr>
           <w:ilvl w:val="0"/>
           <w:numId w:val="1006"/>
         </w:numPr>
-        <w:pStyle w:val="Compact"/>
-      </w:pPr>
-      <w:hyperlink r:id="rId42">
+      </w:pPr>
+      <w:hyperlink r:id="rId29">
         <w:r>
           <w:rPr>
             <w:rStyle w:val="Hyperlink"/>
@@ -2950,13 +2770,13 @@
     </w:p>
     <w:p>
       <w:pPr>
+        <w:pStyle w:val="Compact"/>
         <w:numPr>
           <w:ilvl w:val="0"/>
           <w:numId w:val="1006"/>
         </w:numPr>
-        <w:pStyle w:val="Compact"/>
-      </w:pPr>
-      <w:hyperlink r:id="rId43">
+      </w:pPr>
+      <w:hyperlink r:id="rId30">
         <w:r>
           <w:rPr>
             <w:rStyle w:val="Hyperlink"/>
@@ -2967,13 +2787,13 @@
     </w:p>
     <w:p>
       <w:pPr>
+        <w:pStyle w:val="Compact"/>
         <w:numPr>
           <w:ilvl w:val="0"/>
           <w:numId w:val="1006"/>
         </w:numPr>
-        <w:pStyle w:val="Compact"/>
-      </w:pPr>
-      <w:hyperlink r:id="rId44">
+      </w:pPr>
+      <w:hyperlink r:id="rId31">
         <w:r>
           <w:rPr>
             <w:rStyle w:val="Hyperlink"/>
@@ -2984,13 +2804,13 @@
     </w:p>
     <w:p>
       <w:pPr>
+        <w:pStyle w:val="Compact"/>
         <w:numPr>
           <w:ilvl w:val="0"/>
           <w:numId w:val="1006"/>
         </w:numPr>
-        <w:pStyle w:val="Compact"/>
-      </w:pPr>
-      <w:hyperlink r:id="rId45">
+      </w:pPr>
+      <w:hyperlink r:id="rId32">
         <w:r>
           <w:rPr>
             <w:rStyle w:val="Hyperlink"/>
@@ -2999,7 +2819,13 @@
         </w:r>
       </w:hyperlink>
     </w:p>
-    <w:sectPr/>
+    <w:bookmarkEnd w:id="33"/>
+    <w:bookmarkEnd w:id="34"/>
+    <w:sectPr>
+      <w:footnotePr>
+        <w:numRestart w:val="eachSect"/>
+      </w:footnotePr>
+    </w:sectPr>
   </w:body>
 </w:document>
 </file>
@@ -3030,17 +2856,14 @@
 <file path=word/numbering.xml><?xml version="1.0" encoding="utf-8"?>
 <w:numbering xmlns:w="http://schemas.openxmlformats.org/wordprocessingml/2006/main">
   <w:abstractNum w:abstractNumId="990">
-    <w:nsid w:val="2c1ae401"/>
+    <w:nsid w:val="0000A990"/>
     <w:multiLevelType w:val="multilevel"/>
     <w:lvl w:ilvl="0">
       <w:numFmt w:val="bullet"/>
       <w:lvlText w:val=" "/>
       <w:lvlJc w:val="left"/>
       <w:pPr>
-        <w:tabs>
-          <w:tab w:val="num" w:pos="0"/>
-        </w:tabs>
-        <w:ind w:left="480" w:hanging="480"/>
+        <w:ind w:left="720" w:hanging="360"/>
       </w:pPr>
     </w:lvl>
     <w:lvl w:ilvl="1">
@@ -3048,10 +2871,7 @@
       <w:lvlText w:val=" "/>
       <w:lvlJc w:val="left"/>
       <w:pPr>
-        <w:tabs>
-          <w:tab w:val="num" w:pos="720"/>
-        </w:tabs>
-        <w:ind w:left="1200" w:hanging="480"/>
+        <w:ind w:left="1440" w:hanging="360"/>
       </w:pPr>
     </w:lvl>
     <w:lvl w:ilvl="2">
@@ -3059,10 +2879,7 @@
       <w:lvlText w:val=" "/>
       <w:lvlJc w:val="left"/>
       <w:pPr>
-        <w:tabs>
-          <w:tab w:val="num" w:pos="1440"/>
-        </w:tabs>
-        <w:ind w:left="1920" w:hanging="480"/>
+        <w:ind w:left="2160" w:hanging="360"/>
       </w:pPr>
     </w:lvl>
     <w:lvl w:ilvl="3">
@@ -3070,10 +2887,7 @@
       <w:lvlText w:val=" "/>
       <w:lvlJc w:val="left"/>
       <w:pPr>
-        <w:tabs>
-          <w:tab w:val="num" w:pos="2160"/>
-        </w:tabs>
-        <w:ind w:left="2640" w:hanging="480"/>
+        <w:ind w:left="2880" w:hanging="360"/>
       </w:pPr>
     </w:lvl>
     <w:lvl w:ilvl="4">
@@ -3081,10 +2895,7 @@
       <w:lvlText w:val=" "/>
       <w:lvlJc w:val="left"/>
       <w:pPr>
-        <w:tabs>
-          <w:tab w:val="num" w:pos="2880"/>
-        </w:tabs>
-        <w:ind w:left="3360" w:hanging="480"/>
+        <w:ind w:left="3600" w:hanging="360"/>
       </w:pPr>
     </w:lvl>
     <w:lvl w:ilvl="5">
@@ -3092,10 +2903,7 @@
       <w:lvlText w:val=" "/>
       <w:lvlJc w:val="left"/>
       <w:pPr>
-        <w:tabs>
-          <w:tab w:val="num" w:pos="3600"/>
-        </w:tabs>
-        <w:ind w:left="4080" w:hanging="480"/>
+        <w:ind w:left="4320" w:hanging="360"/>
       </w:pPr>
     </w:lvl>
     <w:lvl w:ilvl="6">
@@ -3103,10 +2911,7 @@
       <w:lvlText w:val=" "/>
       <w:lvlJc w:val="left"/>
       <w:pPr>
-        <w:tabs>
-          <w:tab w:val="num" w:pos="4320"/>
-        </w:tabs>
-        <w:ind w:left="4800" w:hanging="480"/>
+        <w:ind w:left="5040" w:hanging="360"/>
       </w:pPr>
     </w:lvl>
     <w:lvl w:ilvl="7">
@@ -3114,10 +2919,7 @@
       <w:lvlText w:val=" "/>
       <w:lvlJc w:val="left"/>
       <w:pPr>
-        <w:tabs>
-          <w:tab w:val="num" w:pos="5040"/>
-        </w:tabs>
-        <w:ind w:left="5520" w:hanging="480"/>
+        <w:ind w:left="5760" w:hanging="360"/>
       </w:pPr>
     </w:lvl>
     <w:lvl w:ilvl="8">
@@ -3125,15 +2927,12 @@
       <w:lvlText w:val=" "/>
       <w:lvlJc w:val="left"/>
       <w:pPr>
-        <w:tabs>
-          <w:tab w:val="num" w:pos="5760"/>
-        </w:tabs>
-        <w:ind w:left="6240" w:hanging="480"/>
+        <w:ind w:left="6480" w:hanging="360"/>
       </w:pPr>
     </w:lvl>
   </w:abstractNum>
   <w:abstractNum w:abstractNumId="99411">
-    <w:nsid w:val="ea454b4c"/>
+    <w:nsid w:val="00A99411"/>
     <w:multiLevelType w:val="multilevel"/>
     <w:lvl w:ilvl="0">
       <w:start w:val="1"/>
@@ -3141,10 +2940,7 @@
       <w:lvlText w:val="%1."/>
       <w:lvlJc w:val="left"/>
       <w:pPr>
-        <w:tabs>
-          <w:tab w:val="num" w:pos="0"/>
-        </w:tabs>
-        <w:ind w:left="480" w:hanging="480"/>
+        <w:ind w:left="720" w:hanging="360"/>
       </w:pPr>
     </w:lvl>
     <w:lvl w:ilvl="1">
@@ -3153,10 +2949,7 @@
       <w:lvlText w:val="%2."/>
       <w:lvlJc w:val="left"/>
       <w:pPr>
-        <w:tabs>
-          <w:tab w:val="num" w:pos="720"/>
-        </w:tabs>
-        <w:ind w:left="1200" w:hanging="480"/>
+        <w:ind w:left="1440" w:hanging="360"/>
       </w:pPr>
     </w:lvl>
     <w:lvl w:ilvl="2">
@@ -3165,10 +2958,7 @@
       <w:lvlText w:val="%3."/>
       <w:lvlJc w:val="left"/>
       <w:pPr>
-        <w:tabs>
-          <w:tab w:val="num" w:pos="1440"/>
-        </w:tabs>
-        <w:ind w:left="1920" w:hanging="480"/>
+        <w:ind w:left="2160" w:hanging="360"/>
       </w:pPr>
     </w:lvl>
     <w:lvl w:ilvl="3">
@@ -3177,10 +2967,7 @@
       <w:lvlText w:val="%4."/>
       <w:lvlJc w:val="left"/>
       <w:pPr>
-        <w:tabs>
-          <w:tab w:val="num" w:pos="2160"/>
-        </w:tabs>
-        <w:ind w:left="2640" w:hanging="480"/>
+        <w:ind w:left="2880" w:hanging="360"/>
       </w:pPr>
     </w:lvl>
     <w:lvl w:ilvl="4">
@@ -3189,10 +2976,7 @@
       <w:lvlText w:val="%5."/>
       <w:lvlJc w:val="left"/>
       <w:pPr>
-        <w:tabs>
-          <w:tab w:val="num" w:pos="2880"/>
-        </w:tabs>
-        <w:ind w:left="3360" w:hanging="480"/>
+        <w:ind w:left="3600" w:hanging="360"/>
       </w:pPr>
     </w:lvl>
     <w:lvl w:ilvl="5">
@@ -3201,10 +2985,7 @@
       <w:lvlText w:val="%6."/>
       <w:lvlJc w:val="left"/>
       <w:pPr>
-        <w:tabs>
-          <w:tab w:val="num" w:pos="3600"/>
-        </w:tabs>
-        <w:ind w:left="4080" w:hanging="480"/>
+        <w:ind w:left="4320" w:hanging="360"/>
       </w:pPr>
     </w:lvl>
     <w:lvl w:ilvl="6">
@@ -3213,10 +2994,7 @@
       <w:lvlText w:val="%7."/>
       <w:lvlJc w:val="left"/>
       <w:pPr>
-        <w:tabs>
-          <w:tab w:val="num" w:pos="4320"/>
-        </w:tabs>
-        <w:ind w:left="4800" w:hanging="480"/>
+        <w:ind w:left="5040" w:hanging="360"/>
       </w:pPr>
     </w:lvl>
     <w:lvl w:ilvl="7">
@@ -3225,10 +3003,7 @@
       <w:lvlText w:val="%8."/>
       <w:lvlJc w:val="left"/>
       <w:pPr>
-        <w:tabs>
-          <w:tab w:val="num" w:pos="5040"/>
-        </w:tabs>
-        <w:ind w:left="5520" w:hanging="480"/>
+        <w:ind w:left="5760" w:hanging="360"/>
       </w:pPr>
     </w:lvl>
     <w:lvl w:ilvl="8">
@@ -3237,114 +3012,111 @@
       <w:lvlText w:val="%9."/>
       <w:lvlJc w:val="left"/>
       <w:pPr>
-        <w:tabs>
-          <w:tab w:val="num" w:pos="5760"/>
-        </w:tabs>
-        <w:ind w:left="6240" w:hanging="480"/>
+        <w:ind w:left="6480" w:hanging="360"/>
       </w:pPr>
     </w:lvl>
   </w:abstractNum>
   <w:abstractNum w:abstractNumId="991">
-    <w:nsid w:val="71315dca"/>
+    <w:nsid w:val="0000A991"/>
     <w:multiLevelType w:val="multilevel"/>
     <w:lvl w:ilvl="0">
       <w:numFmt w:val="bullet"/>
-      <w:lvlText w:val="•"/>
+      <w:lvlText w:val=""/>
       <w:lvlJc w:val="left"/>
       <w:pPr>
-        <w:tabs>
-          <w:tab w:val="num" w:pos="0"/>
-        </w:tabs>
-        <w:ind w:left="480" w:hanging="480"/>
-      </w:pPr>
+        <w:ind w:left="720" w:hanging="360"/>
+      </w:pPr>
+      <w:rPr>
+        <w:rFonts w:ascii="Symbol" w:hAnsi="Symbol" w:cs="Symbol" w:hint="default"/>
+      </w:rPr>
     </w:lvl>
     <w:lvl w:ilvl="1">
       <w:numFmt w:val="bullet"/>
-      <w:lvlText w:val="–"/>
+      <w:lvlText w:val="o"/>
       <w:lvlJc w:val="left"/>
       <w:pPr>
-        <w:tabs>
-          <w:tab w:val="num" w:pos="720"/>
-        </w:tabs>
-        <w:ind w:left="1200" w:hanging="480"/>
-      </w:pPr>
+        <w:ind w:left="1440" w:hanging="360"/>
+      </w:pPr>
+      <w:rPr>
+        <w:rFonts w:ascii="Courier New" w:hAnsi="Courier New" w:cs="Courier New" w:hint="default"/>
+      </w:rPr>
     </w:lvl>
     <w:lvl w:ilvl="2">
       <w:numFmt w:val="bullet"/>
-      <w:lvlText w:val="•"/>
+      <w:lvlText w:val=""/>
       <w:lvlJc w:val="left"/>
       <w:pPr>
-        <w:tabs>
-          <w:tab w:val="num" w:pos="1440"/>
-        </w:tabs>
-        <w:ind w:left="1920" w:hanging="480"/>
-      </w:pPr>
+        <w:ind w:left="2160" w:hanging="360"/>
+      </w:pPr>
+      <w:rPr>
+        <w:rFonts w:ascii="Wingdings" w:hAnsi="Wingdings" w:cs="Wingdings" w:hint="default"/>
+      </w:rPr>
     </w:lvl>
     <w:lvl w:ilvl="3">
       <w:numFmt w:val="bullet"/>
-      <w:lvlText w:val="–"/>
+      <w:lvlText w:val=""/>
       <w:lvlJc w:val="left"/>
       <w:pPr>
-        <w:tabs>
-          <w:tab w:val="num" w:pos="2160"/>
-        </w:tabs>
-        <w:ind w:left="2640" w:hanging="480"/>
-      </w:pPr>
+        <w:ind w:left="2880" w:hanging="360"/>
+      </w:pPr>
+      <w:rPr>
+        <w:rFonts w:ascii="Symbol" w:hAnsi="Symbol" w:cs="Symbol" w:hint="default"/>
+      </w:rPr>
     </w:lvl>
     <w:lvl w:ilvl="4">
       <w:numFmt w:val="bullet"/>
-      <w:lvlText w:val="•"/>
+      <w:lvlText w:val="o"/>
       <w:lvlJc w:val="left"/>
       <w:pPr>
-        <w:tabs>
-          <w:tab w:val="num" w:pos="2880"/>
-        </w:tabs>
-        <w:ind w:left="3360" w:hanging="480"/>
-      </w:pPr>
+        <w:ind w:left="3600" w:hanging="360"/>
+      </w:pPr>
+      <w:rPr>
+        <w:rFonts w:ascii="Courier New" w:hAnsi="Courier New" w:cs="Courier New" w:hint="default"/>
+      </w:rPr>
     </w:lvl>
     <w:lvl w:ilvl="5">
       <w:numFmt w:val="bullet"/>
-      <w:lvlText w:val="–"/>
+      <w:lvlText w:val=""/>
       <w:lvlJc w:val="left"/>
       <w:pPr>
-        <w:tabs>
-          <w:tab w:val="num" w:pos="3600"/>
-        </w:tabs>
-        <w:ind w:left="4080" w:hanging="480"/>
-      </w:pPr>
+        <w:ind w:left="4320" w:hanging="360"/>
+      </w:pPr>
+      <w:rPr>
+        <w:rFonts w:ascii="Wingdings" w:hAnsi="Wingdings" w:cs="Wingdings" w:hint="default"/>
+      </w:rPr>
     </w:lvl>
     <w:lvl w:ilvl="6">
       <w:numFmt w:val="bullet"/>
-      <w:lvlText w:val="•"/>
+      <w:lvlText w:val=""/>
       <w:lvlJc w:val="left"/>
       <w:pPr>
-        <w:tabs>
-          <w:tab w:val="num" w:pos="4320"/>
-        </w:tabs>
-        <w:ind w:left="4800" w:hanging="480"/>
-      </w:pPr>
+        <w:ind w:left="5040" w:hanging="360"/>
+      </w:pPr>
+      <w:rPr>
+        <w:rFonts w:ascii="Symbol" w:hAnsi="Symbol" w:cs="Symbol" w:hint="default"/>
+      </w:rPr>
     </w:lvl>
     <w:lvl w:ilvl="7">
       <w:numFmt w:val="bullet"/>
-      <w:lvlText w:val="–"/>
+      <w:lvlText w:val="o"/>
       <w:lvlJc w:val="left"/>
       <w:pPr>
-        <w:tabs>
-          <w:tab w:val="num" w:pos="5040"/>
-        </w:tabs>
-        <w:ind w:left="5520" w:hanging="480"/>
-      </w:pPr>
+        <w:ind w:left="5760" w:hanging="360"/>
+      </w:pPr>
+      <w:rPr>
+        <w:rFonts w:ascii="Courier New" w:hAnsi="Courier New" w:cs="Courier New" w:hint="default"/>
+      </w:rPr>
     </w:lvl>
     <w:lvl w:ilvl="8">
       <w:numFmt w:val="bullet"/>
-      <w:lvlText w:val="•"/>
+      <w:lvlText w:val=""/>
       <w:lvlJc w:val="left"/>
       <w:pPr>
-        <w:tabs>
-          <w:tab w:val="num" w:pos="5760"/>
-        </w:tabs>
-        <w:ind w:left="6240" w:hanging="480"/>
-      </w:pPr>
+        <w:ind w:left="6480" w:hanging="360"/>
+      </w:pPr>
+      <w:rPr>
+        <w:rFonts w:ascii="Wingdings" w:hAnsi="Wingdings" w:cs="Wingdings" w:hint="default"/>
+      </w:rPr>
     </w:lvl>
   </w:abstractNum>
   <w:num w:numId="1000">
@@ -3430,10 +3202,10 @@
   <w:docDefaults>
     <w:rPrDefault>
       <w:rPr>
-        <w:rFonts w:asciiTheme="minorHAnsi" w:eastAsiaTheme="minorHAnsi" w:hAnsiTheme="minorHAnsi" w:cstheme="minorBidi"/>
+        <w:rFonts w:asciiTheme="minorHAnsi" w:cstheme="minorBidi" w:eastAsiaTheme="minorEastAsia" w:hAnsiTheme="minorHAnsi"/>
         <w:sz w:val="24"/>
         <w:szCs w:val="24"/>
-        <w:lang w:val="en-US" w:eastAsia="en-US" w:bidi="ar-SA"/>
+        <w:lang w:bidi="ar-SA" w:eastAsia="zh-CN" w:val="en-US"/>
       </w:rPr>
     </w:rPrDefault>
     <w:pPrDefault>
@@ -3442,91 +3214,145 @@
       </w:pPr>
     </w:pPrDefault>
   </w:docDefaults>
-  <w:latentStyles w:defLockedState="0" w:defUIPriority="0" w:defSemiHidden="0" w:defUnhideWhenUsed="0" w:defQFormat="0" w:count="276"/>
-  <w:style w:type="paragraph" w:default="1" w:styleId="Normal">
+  <w:latentStyles w:count="276" w:defLockedState="0" w:defQFormat="0" w:defSemiHidden="0" w:defUIPriority="0" w:defUnhideWhenUsed="0"/>
+  <w:style w:default="1" w:styleId="Normal" w:type="paragraph">
     <w:name w:val="Normal"/>
     <w:qFormat/>
   </w:style>
-  <w:style w:type="paragraph" w:styleId="BodyText">
+  <w:style w:styleId="BodyText" w:type="paragraph">
     <w:name w:val="Body Text"/>
     <w:basedOn w:val="Normal"/>
     <w:link w:val="BodyTextChar"/>
+    <w:qFormat/>
     <w:pPr>
-      <w:spacing w:before="180" w:after="180"/>
+      <w:spacing w:after="180" w:before="180"/>
     </w:pPr>
-    <w:qFormat/>
-  </w:style>
-  <w:style w:type="paragraph" w:customStyle="1" w:styleId="FirstParagraph">
+  </w:style>
+  <w:style w:customStyle="1" w:styleId="FirstParagraph" w:type="paragraph">
     <w:name w:val="First Paragraph"/>
     <w:basedOn w:val="BodyText"/>
     <w:next w:val="BodyText"/>
     <w:qFormat/>
   </w:style>
-  <w:style w:type="paragraph" w:customStyle="1" w:styleId="Compact">
+  <w:style w:customStyle="1" w:styleId="Compact" w:type="paragraph">
     <w:name w:val="Compact"/>
     <w:basedOn w:val="BodyText"/>
     <w:qFormat/>
     <w:pPr>
-      <w:spacing w:before="36" w:after="36"/>
+      <w:spacing w:after="36" w:before="36"/>
     </w:pPr>
   </w:style>
-  <w:style w:type="paragraph" w:styleId="Title">
+  <w:style w:styleId="Title" w:type="paragraph">
     <w:name w:val="Title"/>
     <w:basedOn w:val="Normal"/>
     <w:next w:val="BodyText"/>
+    <w:link w:val="TitleChar"/>
+    <w:uiPriority w:val="10"/>
     <w:qFormat/>
+    <w:rsid w:val="00A10FD9"/>
     <w:pPr>
-      <w:keepNext/>
-      <w:keepLines/>
-      <w:spacing w:before="480" w:after="240"/>
+      <w:spacing w:after="80" w:line="240" w:lineRule="auto"/>
+      <w:contextualSpacing/>
       <w:jc w:val="center"/>
     </w:pPr>
     <w:rPr>
-      <w:rFonts w:asciiTheme="majorHAnsi" w:eastAsiaTheme="majorEastAsia" w:hAnsiTheme="majorHAnsi" w:cstheme="majorBidi"/>
-      <w:b/>
-      <w:bCs/>
-      <w:color w:val="345A8A" w:themeColor="accent1" w:themeShade="B5"/>
-      <w:sz w:val="36"/>
-      <w:szCs w:val="36"/>
-    </w:rPr>
-  </w:style>
-  <w:style w:type="paragraph" w:styleId="Subtitle">
+      <w:rFonts w:asciiTheme="majorHAnsi" w:cstheme="majorBidi" w:eastAsiaTheme="majorEastAsia" w:hAnsiTheme="majorHAnsi"/>
+      <w:sz w:val="56"/>
+      <w:szCs w:val="56"/>
+    </w:rPr>
+  </w:style>
+  <w:style w:customStyle="1" w:styleId="TitleChar" w:type="character">
+    <w:name w:val="Title Char"/>
+    <w:basedOn w:val="DefaultParagraphFont"/>
+    <w:link w:val="Title"/>
+    <w:uiPriority w:val="10"/>
+    <w:rsid w:val="00A10FD9"/>
+    <w:rPr>
+      <w:rFonts w:asciiTheme="majorHAnsi" w:cstheme="majorBidi" w:eastAsiaTheme="majorEastAsia" w:hAnsiTheme="majorHAnsi"/>
+      <w:sz w:val="56"/>
+      <w:szCs w:val="56"/>
+    </w:rPr>
+  </w:style>
+  <w:style w:styleId="Subtitle" w:type="paragraph">
     <w:name w:val="Subtitle"/>
+    <w:basedOn w:val="Title"/>
+    <w:next w:val="BodyText"/>
+    <w:link w:val="SubtitleChar"/>
+    <w:uiPriority w:val="11"/>
+    <w:qFormat/>
+    <w:rsid w:val="00A10FD9"/>
+    <w:pPr>
+      <w:numPr>
+        <w:ilvl w:val="1"/>
+      </w:numPr>
+    </w:pPr>
+    <w:rPr>
+      <w:rFonts w:cstheme="majorBidi" w:eastAsiaTheme="majorEastAsia"/>
+      <w:spacing w:val="15"/>
+      <w:sz w:val="28"/>
+      <w:szCs w:val="28"/>
+    </w:rPr>
+  </w:style>
+  <w:style w:customStyle="1" w:styleId="SubtitleChar" w:type="character">
+    <w:name w:val="Subtitle Char"/>
+    <w:basedOn w:val="DefaultParagraphFont"/>
+    <w:link w:val="Subtitle"/>
+    <w:uiPriority w:val="11"/>
+    <w:rsid w:val="00A10FD9"/>
+    <w:rPr>
+      <w:rFonts w:cstheme="majorBidi" w:eastAsiaTheme="majorEastAsia"/>
+      <w:color w:themeColor="text1" w:themeTint="A6" w:val="595959"/>
+      <w:spacing w:val="15"/>
+      <w:sz w:val="28"/>
+      <w:szCs w:val="28"/>
+    </w:rPr>
+  </w:style>
+  <w:style w:customStyle="1" w:styleId="Author" w:type="paragraph">
+    <w:name w:val="Author"/>
     <w:basedOn w:val="Title"/>
     <w:next w:val="BodyText"/>
     <w:qFormat/>
     <w:pPr>
       <w:keepNext/>
       <w:keepLines/>
-      <w:spacing w:before="240" w:after="240"/>
-      <w:jc w:val="center"/>
     </w:pPr>
     <w:rPr>
-      <w:sz w:val="30"/>
-      <w:szCs w:val="30"/>
-    </w:rPr>
-  </w:style>
-  <w:style w:type="paragraph" w:customStyle="1" w:styleId="Author">
-    <w:name w:val="Author"/>
+      <w:sz w:val="24"/>
+      <w:szCs w:val="24"/>
+    </w:rPr>
+  </w:style>
+  <w:style w:styleId="Date" w:type="paragraph">
+    <w:name w:val="Date"/>
+    <w:basedOn w:val="Title"/>
     <w:next w:val="BodyText"/>
     <w:qFormat/>
     <w:pPr>
       <w:keepNext/>
       <w:keepLines/>
-      <w:jc w:val="center"/>
     </w:pPr>
-  </w:style>
-  <w:style w:type="paragraph" w:styleId="Date">
-    <w:name w:val="Date"/>
-    <w:next w:val="BodyText"/>
+    <w:rPr>
+      <w:sz w:val="24"/>
+      <w:szCs w:val="24"/>
+    </w:rPr>
+  </w:style>
+  <w:style w:customStyle="1" w:styleId="AbstractTitle" w:type="paragraph">
+    <w:name w:val="Abstract Title"/>
+    <w:basedOn w:val="Normal"/>
+    <w:next w:val="Abstract"/>
     <w:qFormat/>
     <w:pPr>
       <w:keepNext/>
       <w:keepLines/>
+      <w:spacing w:after="0" w:before="300"/>
       <w:jc w:val="center"/>
     </w:pPr>
-  </w:style>
-  <w:style w:type="paragraph" w:customStyle="1" w:styleId="Abstract">
+    <w:rPr>
+      <w:b/>
+      <w:sz w:val="20"/>
+      <w:szCs w:val="20"/>
+    </w:rPr>
+  </w:style>
+  <w:style w:customStyle="1" w:styleId="Abstract" w:type="paragraph">
     <w:name w:val="Abstract"/>
     <w:basedOn w:val="Normal"/>
     <w:next w:val="BodyText"/>
@@ -3534,14 +3360,14 @@
     <w:pPr>
       <w:keepNext/>
       <w:keepLines/>
-      <w:spacing w:before="300" w:after="300"/>
+      <w:spacing w:after="300" w:before="100"/>
     </w:pPr>
     <w:rPr>
       <w:sz w:val="20"/>
       <w:szCs w:val="20"/>
     </w:rPr>
   </w:style>
-  <w:style w:type="paragraph" w:styleId="Bibliography">
+  <w:style w:styleId="Bibliography" w:type="paragraph">
     <w:name w:val="Bibliography"/>
     <w:basedOn w:val="Normal"/>
     <w:next w:val="Bibliography"/>
@@ -3549,195 +3375,325 @@
     <w:pPr/>
     <w:rPr/>
   </w:style>
-  <w:style w:type="paragraph" w:styleId="Heading1">
-    <w:name w:val="Heading 1"/>
+  <w:style w:styleId="Heading1" w:type="paragraph">
+    <w:name w:val="heading 1"/>
     <w:basedOn w:val="Normal"/>
     <w:next w:val="BodyText"/>
+    <w:link w:val="Heading1Char"/>
     <w:uiPriority w:val="9"/>
     <w:qFormat/>
+    <w:rsid w:val="00A10FD9"/>
     <w:pPr>
       <w:keepNext/>
       <w:keepLines/>
-      <w:spacing w:before="480" w:after="0"/>
+      <w:spacing w:after="80" w:before="360"/>
       <w:outlineLvl w:val="0"/>
     </w:pPr>
     <w:rPr>
-      <w:rFonts w:asciiTheme="majorHAnsi" w:eastAsiaTheme="majorEastAsia" w:hAnsiTheme="majorHAnsi" w:cstheme="majorBidi"/>
-      <w:b/>
-      <w:bCs/>
-      <w:color w:val="4F81BD" w:themeColor="accent1"/>
-      <w:sz w:val="32"/>
-      <w:szCs w:val="32"/>
-    </w:rPr>
-  </w:style>
-  <w:style w:type="paragraph" w:styleId="Heading2">
-    <w:name w:val="Heading 2"/>
+      <w:rFonts w:asciiTheme="majorHAnsi" w:cstheme="majorBidi" w:eastAsiaTheme="majorEastAsia" w:hAnsiTheme="majorHAnsi"/>
+      <w:color w:themeColor="accent1" w:themeShade="BF" w:val="0F4761"/>
+      <w:sz w:val="40"/>
+      <w:szCs w:val="40"/>
+    </w:rPr>
+  </w:style>
+  <w:style w:styleId="Heading2" w:type="paragraph">
+    <w:name w:val="heading 2"/>
     <w:basedOn w:val="Normal"/>
     <w:next w:val="BodyText"/>
+    <w:link w:val="Heading2Char"/>
     <w:uiPriority w:val="9"/>
+    <w:semiHidden/>
     <w:unhideWhenUsed/>
     <w:qFormat/>
+    <w:rsid w:val="00A10FD9"/>
     <w:pPr>
       <w:keepNext/>
       <w:keepLines/>
-      <w:spacing w:before="200" w:after="0"/>
+      <w:spacing w:after="80" w:before="160"/>
       <w:outlineLvl w:val="1"/>
     </w:pPr>
     <w:rPr>
-      <w:rFonts w:asciiTheme="majorHAnsi" w:eastAsiaTheme="majorEastAsia" w:hAnsiTheme="majorHAnsi" w:cstheme="majorBidi"/>
-      <w:b/>
-      <w:bCs/>
-      <w:color w:val="4F81BD" w:themeColor="accent1"/>
-      <w:sz w:val="28"/>
-      <w:szCs w:val="28"/>
-    </w:rPr>
-  </w:style>
-  <w:style w:type="paragraph" w:styleId="Heading3">
-    <w:name w:val="Heading 3"/>
+      <w:rFonts w:asciiTheme="majorHAnsi" w:cstheme="majorBidi" w:eastAsiaTheme="majorEastAsia" w:hAnsiTheme="majorHAnsi"/>
+      <w:color w:themeColor="accent1" w:themeShade="BF" w:val="0F4761"/>
+      <w:sz w:val="32"/>
+      <w:szCs w:val="32"/>
+    </w:rPr>
+  </w:style>
+  <w:style w:styleId="Heading3" w:type="paragraph">
+    <w:name w:val="heading 3"/>
     <w:basedOn w:val="Normal"/>
     <w:next w:val="BodyText"/>
+    <w:link w:val="Heading3Char"/>
     <w:uiPriority w:val="9"/>
+    <w:semiHidden/>
     <w:unhideWhenUsed/>
     <w:qFormat/>
+    <w:rsid w:val="00A10FD9"/>
     <w:pPr>
       <w:keepNext/>
       <w:keepLines/>
-      <w:spacing w:before="200" w:after="0"/>
+      <w:spacing w:after="80" w:before="160"/>
       <w:outlineLvl w:val="2"/>
     </w:pPr>
     <w:rPr>
-      <w:rFonts w:asciiTheme="majorHAnsi" w:eastAsiaTheme="majorEastAsia" w:hAnsiTheme="majorHAnsi" w:cstheme="majorBidi"/>
-      <w:b/>
-      <w:bCs/>
-      <w:color w:val="4F81BD" w:themeColor="accent1"/>
-      <w:sz w:val="24"/>
-      <w:szCs w:val="24"/>
-    </w:rPr>
-  </w:style>
-  <w:style w:type="paragraph" w:styleId="Heading4">
-    <w:name w:val="Heading 4"/>
+      <w:rFonts w:cstheme="majorBidi" w:eastAsiaTheme="majorEastAsia"/>
+      <w:color w:themeColor="accent1" w:themeShade="BF" w:val="0F4761"/>
+      <w:sz w:val="28"/>
+      <w:szCs w:val="28"/>
+    </w:rPr>
+  </w:style>
+  <w:style w:styleId="Heading4" w:type="paragraph">
+    <w:name w:val="heading 4"/>
     <w:basedOn w:val="Normal"/>
     <w:next w:val="BodyText"/>
+    <w:link w:val="Heading4Char"/>
     <w:uiPriority w:val="9"/>
+    <w:semiHidden/>
     <w:unhideWhenUsed/>
     <w:qFormat/>
+    <w:rsid w:val="00A10FD9"/>
     <w:pPr>
       <w:keepNext/>
       <w:keepLines/>
-      <w:spacing w:before="200" w:after="0"/>
+      <w:spacing w:after="40" w:before="80"/>
       <w:outlineLvl w:val="3"/>
     </w:pPr>
     <w:rPr>
-      <w:rFonts w:asciiTheme="majorHAnsi" w:eastAsiaTheme="majorEastAsia" w:hAnsiTheme="majorHAnsi" w:cstheme="majorBidi"/>
+      <w:rFonts w:cstheme="majorBidi" w:eastAsiaTheme="majorEastAsia"/>
       <w:i/>
-      <w:bCs/>
-      <w:color w:val="4F81BD" w:themeColor="accent1"/>
-      <w:sz w:val="24"/>
-      <w:szCs w:val="24"/>
-    </w:rPr>
-  </w:style>
-  <w:style w:type="paragraph" w:styleId="Heading5">
-    <w:name w:val="Heading 5"/>
+      <w:iCs/>
+      <w:color w:themeColor="accent1" w:themeShade="BF" w:val="0F4761"/>
+    </w:rPr>
+  </w:style>
+  <w:style w:styleId="Heading5" w:type="paragraph">
+    <w:name w:val="heading 5"/>
     <w:basedOn w:val="Normal"/>
     <w:next w:val="BodyText"/>
+    <w:link w:val="Heading5Char"/>
     <w:uiPriority w:val="9"/>
+    <w:semiHidden/>
     <w:unhideWhenUsed/>
     <w:qFormat/>
+    <w:rsid w:val="00A10FD9"/>
     <w:pPr>
       <w:keepNext/>
       <w:keepLines/>
-      <w:spacing w:before="200" w:after="0"/>
+      <w:spacing w:after="40" w:before="80"/>
       <w:outlineLvl w:val="4"/>
     </w:pPr>
     <w:rPr>
-      <w:rFonts w:asciiTheme="majorHAnsi" w:eastAsiaTheme="majorEastAsia" w:hAnsiTheme="majorHAnsi" w:cstheme="majorBidi"/>
-      <w:iCs/>
-      <w:color w:val="4F81BD" w:themeColor="accent1"/>
-      <w:sz w:val="24"/>
-      <w:szCs w:val="24"/>
-    </w:rPr>
-  </w:style>
-  <w:style w:type="paragraph" w:styleId="Heading6">
-    <w:name w:val="Heading 6"/>
+      <w:rFonts w:cstheme="majorBidi" w:eastAsiaTheme="majorEastAsia"/>
+      <w:color w:themeColor="accent1" w:themeShade="BF" w:val="0F4761"/>
+    </w:rPr>
+  </w:style>
+  <w:style w:styleId="Heading6" w:type="paragraph">
+    <w:name w:val="heading 6"/>
     <w:basedOn w:val="Normal"/>
     <w:next w:val="BodyText"/>
+    <w:link w:val="Heading6Char"/>
     <w:uiPriority w:val="9"/>
+    <w:semiHidden/>
     <w:unhideWhenUsed/>
     <w:qFormat/>
+    <w:rsid w:val="00A10FD9"/>
     <w:pPr>
       <w:keepNext/>
       <w:keepLines/>
-      <w:spacing w:before="200" w:after="0"/>
+      <w:spacing w:after="0" w:before="40"/>
       <w:outlineLvl w:val="5"/>
     </w:pPr>
     <w:rPr>
-      <w:rFonts w:asciiTheme="majorHAnsi" w:eastAsiaTheme="majorEastAsia" w:hAnsiTheme="majorHAnsi" w:cstheme="majorBidi"/>
-      <w:color w:val="4F81BD" w:themeColor="accent1"/>
-      <w:sz w:val="24"/>
-      <w:szCs w:val="24"/>
-    </w:rPr>
-  </w:style>
-  <w:style w:type="paragraph" w:styleId="Heading7">
-    <w:name w:val="Heading 7"/>
+      <w:rFonts w:cstheme="majorBidi" w:eastAsiaTheme="majorEastAsia"/>
+      <w:i/>
+      <w:iCs/>
+      <w:color w:themeColor="text1" w:themeTint="A6" w:val="595959"/>
+    </w:rPr>
+  </w:style>
+  <w:style w:styleId="Heading7" w:type="paragraph">
+    <w:name w:val="heading 7"/>
     <w:basedOn w:val="Normal"/>
     <w:next w:val="BodyText"/>
+    <w:link w:val="Heading7Char"/>
     <w:uiPriority w:val="9"/>
+    <w:semiHidden/>
     <w:unhideWhenUsed/>
     <w:qFormat/>
+    <w:rsid w:val="00A10FD9"/>
     <w:pPr>
       <w:keepNext/>
       <w:keepLines/>
-      <w:spacing w:before="200" w:after="0"/>
+      <w:spacing w:after="0" w:before="40"/>
       <w:outlineLvl w:val="6"/>
     </w:pPr>
     <w:rPr>
-      <w:rFonts w:asciiTheme="majorHAnsi" w:eastAsiaTheme="majorEastAsia" w:hAnsiTheme="majorHAnsi" w:cstheme="majorBidi"/>
-      <w:color w:val="4F81BD" w:themeColor="accent1"/>
-      <w:sz w:val="24"/>
-      <w:szCs w:val="24"/>
-    </w:rPr>
-  </w:style>
-  <w:style w:type="paragraph" w:styleId="Heading8">
-    <w:name w:val="Heading 8"/>
+      <w:rFonts w:cstheme="majorBidi" w:eastAsiaTheme="majorEastAsia"/>
+      <w:color w:themeColor="text1" w:themeTint="A6" w:val="595959"/>
+    </w:rPr>
+  </w:style>
+  <w:style w:styleId="Heading8" w:type="paragraph">
+    <w:name w:val="heading 8"/>
     <w:basedOn w:val="Normal"/>
     <w:next w:val="BodyText"/>
+    <w:link w:val="Heading8Char"/>
     <w:uiPriority w:val="9"/>
+    <w:semiHidden/>
     <w:unhideWhenUsed/>
     <w:qFormat/>
+    <w:rsid w:val="00A10FD9"/>
     <w:pPr>
       <w:keepNext/>
       <w:keepLines/>
-      <w:spacing w:before="200" w:after="0"/>
+      <w:spacing w:after="0"/>
       <w:outlineLvl w:val="7"/>
     </w:pPr>
     <w:rPr>
-      <w:rFonts w:asciiTheme="majorHAnsi" w:eastAsiaTheme="majorEastAsia" w:hAnsiTheme="majorHAnsi" w:cstheme="majorBidi"/>
-      <w:color w:val="4F81BD" w:themeColor="accent1"/>
-      <w:sz w:val="24"/>
-      <w:szCs w:val="24"/>
-    </w:rPr>
-  </w:style>
-  <w:style w:type="paragraph" w:styleId="Heading9">
-    <w:name w:val="Heading 9"/>
+      <w:rFonts w:cstheme="majorBidi" w:eastAsiaTheme="majorEastAsia"/>
+      <w:i/>
+      <w:iCs/>
+      <w:color w:themeColor="text1" w:themeTint="D8" w:val="272727"/>
+    </w:rPr>
+  </w:style>
+  <w:style w:styleId="Heading9" w:type="paragraph">
+    <w:name w:val="heading 9"/>
     <w:basedOn w:val="Normal"/>
     <w:next w:val="BodyText"/>
+    <w:link w:val="Heading9Char"/>
     <w:uiPriority w:val="9"/>
+    <w:semiHidden/>
     <w:unhideWhenUsed/>
     <w:qFormat/>
+    <w:rsid w:val="00A10FD9"/>
     <w:pPr>
       <w:keepNext/>
       <w:keepLines/>
-      <w:spacing w:before="200" w:after="0"/>
+      <w:spacing w:after="0"/>
       <w:outlineLvl w:val="8"/>
     </w:pPr>
     <w:rPr>
-      <w:rFonts w:asciiTheme="majorHAnsi" w:eastAsiaTheme="majorEastAsia" w:hAnsiTheme="majorHAnsi" w:cstheme="majorBidi"/>
-      <w:color w:val="4F81BD" w:themeColor="accent1"/>
-      <w:sz w:val="24"/>
-      <w:szCs w:val="24"/>
-    </w:rPr>
-  </w:style>
-  <w:style w:type="paragraph" w:styleId="BlockText">
+      <w:rFonts w:cstheme="majorBidi" w:eastAsiaTheme="majorEastAsia"/>
+      <w:color w:themeColor="text1" w:themeTint="D8" w:val="272727"/>
+    </w:rPr>
+  </w:style>
+  <w:style w:customStyle="1" w:styleId="Heading1Char" w:type="character">
+    <w:name w:val="Heading 1 Char"/>
+    <w:basedOn w:val="DefaultParagraphFont"/>
+    <w:link w:val="Heading1"/>
+    <w:uiPriority w:val="9"/>
+    <w:rsid w:val="00A10FD9"/>
+    <w:rPr>
+      <w:rFonts w:asciiTheme="majorHAnsi" w:cstheme="majorBidi" w:eastAsiaTheme="majorEastAsia" w:hAnsiTheme="majorHAnsi"/>
+      <w:color w:themeColor="accent1" w:themeShade="BF" w:val="0F4761"/>
+      <w:sz w:val="40"/>
+      <w:szCs w:val="40"/>
+    </w:rPr>
+  </w:style>
+  <w:style w:customStyle="1" w:styleId="Heading2Char" w:type="character">
+    <w:name w:val="Heading 2 Char"/>
+    <w:basedOn w:val="DefaultParagraphFont"/>
+    <w:link w:val="Heading2"/>
+    <w:uiPriority w:val="9"/>
+    <w:semiHidden/>
+    <w:rsid w:val="00A10FD9"/>
+    <w:rPr>
+      <w:rFonts w:asciiTheme="majorHAnsi" w:cstheme="majorBidi" w:eastAsiaTheme="majorEastAsia" w:hAnsiTheme="majorHAnsi"/>
+      <w:color w:themeColor="accent1" w:themeShade="BF" w:val="0F4761"/>
+      <w:sz w:val="32"/>
+      <w:szCs w:val="32"/>
+    </w:rPr>
+  </w:style>
+  <w:style w:customStyle="1" w:styleId="Heading3Char" w:type="character">
+    <w:name w:val="Heading 3 Char"/>
+    <w:basedOn w:val="DefaultParagraphFont"/>
+    <w:link w:val="Heading3"/>
+    <w:uiPriority w:val="9"/>
+    <w:semiHidden/>
+    <w:rsid w:val="00A10FD9"/>
+    <w:rPr>
+      <w:rFonts w:cstheme="majorBidi" w:eastAsiaTheme="majorEastAsia"/>
+      <w:color w:themeColor="accent1" w:themeShade="BF" w:val="0F4761"/>
+      <w:sz w:val="28"/>
+      <w:szCs w:val="28"/>
+    </w:rPr>
+  </w:style>
+  <w:style w:customStyle="1" w:styleId="Heading4Char" w:type="character">
+    <w:name w:val="Heading 4 Char"/>
+    <w:basedOn w:val="DefaultParagraphFont"/>
+    <w:link w:val="Heading4"/>
+    <w:uiPriority w:val="9"/>
+    <w:semiHidden/>
+    <w:rsid w:val="00A10FD9"/>
+    <w:rPr>
+      <w:rFonts w:cstheme="majorBidi" w:eastAsiaTheme="majorEastAsia"/>
+      <w:i/>
+      <w:iCs/>
+      <w:color w:themeColor="accent1" w:themeShade="BF" w:val="0F4761"/>
+    </w:rPr>
+  </w:style>
+  <w:style w:customStyle="1" w:styleId="Heading5Char" w:type="character">
+    <w:name w:val="Heading 5 Char"/>
+    <w:basedOn w:val="DefaultParagraphFont"/>
+    <w:link w:val="Heading5"/>
+    <w:uiPriority w:val="9"/>
+    <w:semiHidden/>
+    <w:rsid w:val="00A10FD9"/>
+    <w:rPr>
+      <w:rFonts w:cstheme="majorBidi" w:eastAsiaTheme="majorEastAsia"/>
+      <w:color w:themeColor="accent1" w:themeShade="BF" w:val="0F4761"/>
+    </w:rPr>
+  </w:style>
+  <w:style w:customStyle="1" w:styleId="Heading6Char" w:type="character">
+    <w:name w:val="Heading 6 Char"/>
+    <w:basedOn w:val="DefaultParagraphFont"/>
+    <w:link w:val="Heading6"/>
+    <w:uiPriority w:val="9"/>
+    <w:semiHidden/>
+    <w:rsid w:val="00A10FD9"/>
+    <w:rPr>
+      <w:rFonts w:cstheme="majorBidi" w:eastAsiaTheme="majorEastAsia"/>
+      <w:i/>
+      <w:iCs/>
+      <w:color w:themeColor="text1" w:themeTint="A6" w:val="595959"/>
+    </w:rPr>
+  </w:style>
+  <w:style w:customStyle="1" w:styleId="Heading7Char" w:type="character">
+    <w:name w:val="Heading 7 Char"/>
+    <w:basedOn w:val="DefaultParagraphFont"/>
+    <w:link w:val="Heading7"/>
+    <w:uiPriority w:val="9"/>
+    <w:semiHidden/>
+    <w:rsid w:val="00A10FD9"/>
+    <w:rPr>
+      <w:rFonts w:cstheme="majorBidi" w:eastAsiaTheme="majorEastAsia"/>
+      <w:color w:themeColor="text1" w:themeTint="A6" w:val="595959"/>
+    </w:rPr>
+  </w:style>
+  <w:style w:customStyle="1" w:styleId="Heading8Char" w:type="character">
+    <w:name w:val="Heading 8 Char"/>
+    <w:basedOn w:val="DefaultParagraphFont"/>
+    <w:link w:val="Heading8"/>
+    <w:uiPriority w:val="9"/>
+    <w:semiHidden/>
+    <w:rsid w:val="00A10FD9"/>
+    <w:rPr>
+      <w:rFonts w:cstheme="majorBidi" w:eastAsiaTheme="majorEastAsia"/>
+      <w:i/>
+      <w:iCs/>
+      <w:color w:themeColor="text1" w:themeTint="D8" w:val="272727"/>
+    </w:rPr>
+  </w:style>
+  <w:style w:customStyle="1" w:styleId="Heading9Char" w:type="character">
+    <w:name w:val="Heading 9 Char"/>
+    <w:basedOn w:val="DefaultParagraphFont"/>
+    <w:link w:val="Heading9"/>
+    <w:uiPriority w:val="9"/>
+    <w:semiHidden/>
+    <w:rsid w:val="00A10FD9"/>
+    <w:rPr>
+      <w:rFonts w:cstheme="majorBidi" w:eastAsiaTheme="majorEastAsia"/>
+      <w:color w:themeColor="text1" w:themeTint="D8" w:val="272727"/>
+    </w:rPr>
+  </w:style>
+  <w:style w:styleId="BlockText" w:type="paragraph">
     <w:name w:val="Block Text"/>
     <w:basedOn w:val="BodyText"/>
     <w:next w:val="BodyText"/>
@@ -3745,11 +3701,11 @@
     <w:unhideWhenUsed/>
     <w:qFormat/>
     <w:pPr>
-      <w:spacing w:before="100" w:after="100"/>
+      <w:spacing w:after="100" w:before="100"/>
       <w:ind w:firstLine="0" w:left="480" w:right="480"/>
     </w:pPr>
   </w:style>
-  <w:style w:type="paragraph" w:styleId="FootnoteText">
+  <w:style w:styleId="FootnoteText" w:type="paragraph">
     <w:name w:val="Footnote Text"/>
     <w:basedOn w:val="Normal"/>
     <w:next w:val="FootnoteText"/>
@@ -3757,28 +3713,48 @@
     <w:unhideWhenUsed/>
     <w:qFormat/>
   </w:style>
-  <w:style w:type="character" w:default="1" w:styleId="DefaultParagraphFont">
+  <w:style w:styleId="FootnoteBlockText" w:type="paragraph">
+    <w:name w:val="Footnote Block Text"/>
+    <w:basedOn w:val="FootnoteText"/>
+    <w:next w:val="FootnoteText"/>
+    <w:uiPriority w:val="9"/>
+    <w:unhideWhenUsed/>
+    <w:qFormat/>
+    <w:pPr>
+      <w:spacing w:after="100" w:before="100"/>
+      <w:ind w:firstLine="0" w:left="480" w:right="480"/>
+    </w:pPr>
+  </w:style>
+  <w:style w:default="1" w:styleId="DefaultParagraphFont" w:type="character">
     <w:name w:val="Default Paragraph Font"/>
     <w:semiHidden/>
     <w:unhideWhenUsed/>
   </w:style>
-  <w:style w:type="table" w:default="1" w:styleId="Table">
+  <w:style w:default="1" w:styleId="Table" w:type="table">
     <w:name w:val="Table"/>
     <w:basedOn w:val="TableNormal"/>
     <w:semiHidden/>
     <w:unhideWhenUsed/>
     <w:qFormat/>
     <w:tblPr>
-      <w:tblInd w:w="0" w:type="dxa"/>
+      <w:tblInd w:type="dxa" w:w="0"/>
       <w:tblCellMar>
-        <w:top w:w="0" w:type="dxa"/>
-        <w:left w:w="108" w:type="dxa"/>
-        <w:bottom w:w="0" w:type="dxa"/>
-        <w:right w:w="108" w:type="dxa"/>
+        <w:top w:type="dxa" w:w="0"/>
+        <w:left w:type="dxa" w:w="108"/>
+        <w:bottom w:type="dxa" w:w="0"/>
+        <w:right w:type="dxa" w:w="108"/>
       </w:tblCellMar>
     </w:tblPr>
-  </w:style>
-  <w:style w:type="paragraph" w:customStyle="1" w:styleId="DefinitionTerm">
+    <w:tblStylePr w:type="firstRow">
+      <w:tcPr>
+        <w:tcBorders>
+          <w:bottom w:val="single"/>
+        </w:tcBorders>
+        <w:vAlign w:val="bottom"/>
+      </w:tcPr>
+    </w:tblStylePr>
+  </w:style>
+  <w:style w:customStyle="1" w:styleId="DefinitionTerm" w:type="paragraph">
     <w:name w:val="Definition Term"/>
     <w:basedOn w:val="Normal"/>
     <w:next w:val="Definition"/>
@@ -3791,49 +3767,49 @@
       <w:b/>
     </w:rPr>
   </w:style>
-  <w:style w:type="paragraph" w:customStyle="1" w:styleId="Definition">
+  <w:style w:customStyle="1" w:styleId="Definition" w:type="paragraph">
     <w:name w:val="Definition"/>
     <w:basedOn w:val="Normal"/>
   </w:style>
-  <w:style w:type="paragraph" w:styleId="Caption">
+  <w:style w:styleId="Caption" w:type="paragraph">
     <w:name w:val="Caption"/>
     <w:basedOn w:val="Normal"/>
     <w:link w:val="BodyTextChar"/>
     <w:pPr>
-      <w:spacing w:before="0" w:after="120"/>
+      <w:spacing w:after="120" w:before="0"/>
     </w:pPr>
     <w:rPr>
       <w:i/>
     </w:rPr>
   </w:style>
-  <w:style w:type="paragraph" w:customStyle="1" w:styleId="TableCaption">
+  <w:style w:customStyle="1" w:styleId="TableCaption" w:type="paragraph">
     <w:name w:val="Table Caption"/>
     <w:basedOn w:val="Caption"/>
     <w:pPr>
       <w:keepNext/>
     </w:pPr>
   </w:style>
-  <w:style w:type="paragraph" w:customStyle="1" w:styleId="ImageCaption">
+  <w:style w:customStyle="1" w:styleId="ImageCaption" w:type="paragraph">
     <w:name w:val="Image Caption"/>
     <w:basedOn w:val="Caption"/>
   </w:style>
-  <w:style w:type="paragraph" w:customStyle="1" w:styleId="Figure">
+  <w:style w:customStyle="1" w:styleId="Figure" w:type="paragraph">
     <w:name w:val="Figure"/>
     <w:basedOn w:val="Normal"/>
   </w:style>
-  <w:style w:type="paragraph" w:customStyle="1" w:styleId="CaptionedFigure">
+  <w:style w:customStyle="1" w:styleId="CaptionedFigure" w:type="paragraph">
     <w:name w:val="Captioned Figure"/>
     <w:basedOn w:val="Figure"/>
     <w:pPr>
       <w:keepNext/>
     </w:pPr>
   </w:style>
-  <w:style w:type="character" w:customStyle="1" w:styleId="BodyTextChar">
+  <w:style w:customStyle="1" w:styleId="BodyTextChar" w:type="character">
     <w:name w:val="Body Text Char"/>
     <w:basedOn w:val="DefaultParagraphFont"/>
     <w:link w:val="BodyText"/>
   </w:style>
-  <w:style w:type="character" w:customStyle="1" w:styleId="VerbatimChar">
+  <w:style w:customStyle="1" w:styleId="VerbatimChar" w:type="character">
     <w:name w:val="Verbatim Char"/>
     <w:basedOn w:val="BodyTextChar"/>
     <w:rPr>
@@ -3841,21 +3817,25 @@
       <w:sz w:val="22"/>
     </w:rPr>
   </w:style>
-  <w:style w:type="character" w:styleId="FootnoteReference">
+  <w:style w:customStyle="1" w:styleId="SectionNumber" w:type="character">
+    <w:name w:val="Section Number"/>
+    <w:basedOn w:val="BodyTextChar"/>
+  </w:style>
+  <w:style w:styleId="FootnoteReference" w:type="character">
     <w:name w:val="Footnote Reference"/>
     <w:basedOn w:val="BodyTextChar"/>
     <w:rPr>
       <w:vertAlign w:val="superscript"/>
     </w:rPr>
   </w:style>
-  <w:style w:type="character" w:styleId="Hyperlink">
+  <w:style w:styleId="Hyperlink" w:type="character">
     <w:name w:val="Hyperlink"/>
     <w:basedOn w:val="BodyTextChar"/>
     <w:rPr>
-      <w:color w:val="4F81BD" w:themeColor="accent1"/>
-    </w:rPr>
-  </w:style>
-  <w:style w:type="paragraph" w:styleId="TOCHeading">
+      <w:color w:themeColor="accent1" w:val="4F81BD"/>
+    </w:rPr>
+  </w:style>
+  <w:style w:styleId="TOCHeading" w:type="paragraph">
     <w:name w:val="TOC Heading"/>
     <w:basedOn w:val="Heading1"/>
     <w:next w:val="BodyText"/>
@@ -3867,10 +3847,10 @@
       <w:outlineLvl w:val="9"/>
     </w:pPr>
     <w:rPr>
-      <w:rFonts w:asciiTheme="majorHAnsi" w:eastAsiaTheme="majorEastAsia" w:hAnsiTheme="majorHAnsi" w:cstheme="majorBidi"/>
+      <w:rFonts w:asciiTheme="majorHAnsi" w:cstheme="majorBidi" w:eastAsiaTheme="majorEastAsia" w:hAnsiTheme="majorHAnsi"/>
       <w:b w:val="0"/>
       <w:bCs w:val="0"/>
-      <w:color w:val="365F91" w:themeColor="accent1" w:themeShade="BF"/>
+      <w:color w:themeColor="accent1" w:themeShade="BF" w:val="365F91"/>
     </w:rPr>
   </w:style>
   <w:style w:type="paragraph" w:customStyle="1" w:styleId="SourceCode">
@@ -3885,8 +3865,8 @@
     <w:name w:val="KeywordTok"/>
     <w:basedOn w:val="VerbatimChar"/>
     <w:rPr>
+      <w:b/>
       <w:color w:val="007020"/>
-      <w:b/>
     </w:rPr>
   </w:style>
   <w:style w:type="character" w:customStyle="1" w:styleId="DataTypeTok">
@@ -3962,40 +3942,43 @@
   <w:style w:type="character" w:customStyle="1" w:styleId="ImportTok">
     <w:name w:val="ImportTok"/>
     <w:basedOn w:val="VerbatimChar"/>
-    <w:rPr/>
+    <w:rPr>
+      <w:b/>
+      <w:color w:val="008000"/>
+    </w:rPr>
   </w:style>
   <w:style w:type="character" w:customStyle="1" w:styleId="CommentTok">
     <w:name w:val="CommentTok"/>
     <w:basedOn w:val="VerbatimChar"/>
     <w:rPr>
+      <w:i/>
       <w:color w:val="60a0b0"/>
-      <w:i/>
     </w:rPr>
   </w:style>
   <w:style w:type="character" w:customStyle="1" w:styleId="DocumentationTok">
     <w:name w:val="DocumentationTok"/>
     <w:basedOn w:val="VerbatimChar"/>
     <w:rPr>
+      <w:i/>
       <w:color w:val="ba2121"/>
-      <w:i/>
     </w:rPr>
   </w:style>
   <w:style w:type="character" w:customStyle="1" w:styleId="AnnotationTok">
     <w:name w:val="AnnotationTok"/>
     <w:basedOn w:val="VerbatimChar"/>
     <w:rPr>
-      <w:color w:val="60a0b0"/>
       <w:b/>
       <w:i/>
+      <w:color w:val="60a0b0"/>
     </w:rPr>
   </w:style>
   <w:style w:type="character" w:customStyle="1" w:styleId="CommentVarTok">
     <w:name w:val="CommentVarTok"/>
     <w:basedOn w:val="VerbatimChar"/>
     <w:rPr>
-      <w:color w:val="60a0b0"/>
       <w:b/>
       <w:i/>
+      <w:color w:val="60a0b0"/>
     </w:rPr>
   </w:style>
   <w:style w:type="character" w:customStyle="1" w:styleId="OtherTok">
@@ -4023,8 +4006,8 @@
     <w:name w:val="ControlFlowTok"/>
     <w:basedOn w:val="VerbatimChar"/>
     <w:rPr>
+      <w:b/>
       <w:color w:val="007020"/>
-      <w:b/>
     </w:rPr>
   </w:style>
   <w:style w:type="character" w:customStyle="1" w:styleId="OperatorTok">
@@ -4037,7 +4020,9 @@
   <w:style w:type="character" w:customStyle="1" w:styleId="BuiltInTok">
     <w:name w:val="BuiltInTok"/>
     <w:basedOn w:val="VerbatimChar"/>
-    <w:rPr/>
+    <w:rPr>
+      <w:color w:val="008000"/>
+    </w:rPr>
   </w:style>
   <w:style w:type="character" w:customStyle="1" w:styleId="ExtensionTok">
     <w:name w:val="ExtensionTok"/>
@@ -4067,34 +4052,34 @@
     <w:name w:val="InformationTok"/>
     <w:basedOn w:val="VerbatimChar"/>
     <w:rPr>
-      <w:color w:val="60a0b0"/>
       <w:b/>
       <w:i/>
+      <w:color w:val="60a0b0"/>
     </w:rPr>
   </w:style>
   <w:style w:type="character" w:customStyle="1" w:styleId="WarningTok">
     <w:name w:val="WarningTok"/>
     <w:basedOn w:val="VerbatimChar"/>
     <w:rPr>
-      <w:color w:val="60a0b0"/>
       <w:b/>
       <w:i/>
+      <w:color w:val="60a0b0"/>
     </w:rPr>
   </w:style>
   <w:style w:type="character" w:customStyle="1" w:styleId="AlertTok">
     <w:name w:val="AlertTok"/>
     <w:basedOn w:val="VerbatimChar"/>
     <w:rPr>
+      <w:b/>
       <w:color w:val="ff0000"/>
-      <w:b/>
     </w:rPr>
   </w:style>
   <w:style w:type="character" w:customStyle="1" w:styleId="ErrorTok">
     <w:name w:val="ErrorTok"/>
     <w:basedOn w:val="VerbatimChar"/>
     <w:rPr>
+      <w:b/>
       <w:color w:val="ff0000"/>
-      <w:b/>
     </w:rPr>
   </w:style>
   <w:style w:type="character" w:customStyle="1" w:styleId="NormalTok">
@@ -4116,44 +4101,44 @@
         <a:sysClr val="window" lastClr="FFFFFF"/>
       </a:lt1>
       <a:dk2>
-        <a:srgbClr val="1F497D"/>
+        <a:srgbClr val="0E2841"/>
       </a:dk2>
       <a:lt2>
-        <a:srgbClr val="EEECE1"/>
+        <a:srgbClr val="E8E8E8"/>
       </a:lt2>
       <a:accent1>
-        <a:srgbClr val="4F81BD"/>
+        <a:srgbClr val="156082"/>
       </a:accent1>
       <a:accent2>
-        <a:srgbClr val="C0504D"/>
+        <a:srgbClr val="E97132"/>
       </a:accent2>
       <a:accent3>
-        <a:srgbClr val="9BBB59"/>
+        <a:srgbClr val="196B24"/>
       </a:accent3>
       <a:accent4>
-        <a:srgbClr val="8064A2"/>
+        <a:srgbClr val="0F9ED5"/>
       </a:accent4>
       <a:accent5>
-        <a:srgbClr val="4BACC6"/>
+        <a:srgbClr val="A02B93"/>
       </a:accent5>
       <a:accent6>
-        <a:srgbClr val="F79646"/>
+        <a:srgbClr val="4EA72E"/>
       </a:accent6>
       <a:hlink>
-        <a:srgbClr val="0000FF"/>
+        <a:srgbClr val="467886"/>
       </a:hlink>
       <a:folHlink>
-        <a:srgbClr val="800080"/>
+        <a:srgbClr val="96607D"/>
       </a:folHlink>
     </a:clrScheme>
     <a:fontScheme name="Office">
       <a:majorFont>
-        <a:latin typeface="Calibri"/>
+        <a:latin typeface="Aptos Display" panose="02110004020202020204"/>
         <a:ea typeface=""/>
         <a:cs typeface=""/>
-        <a:font script="Jpan" typeface="ＭＳ ゴシック"/>
+        <a:font script="Jpan" typeface="游ゴシック Light"/>
         <a:font script="Hang" typeface="맑은 고딕"/>
-        <a:font script="Hans" typeface="宋体"/>
+        <a:font script="Hans" typeface="等线 Light"/>
         <a:font script="Hant" typeface="新細明體"/>
         <a:font script="Arab" typeface="Times New Roman"/>
         <a:font script="Hebr" typeface="Times New Roman"/>
@@ -4180,14 +4165,32 @@
         <a:font script="Mong" typeface="Mongolian Baiti"/>
         <a:font script="Viet" typeface="Times New Roman"/>
         <a:font script="Uigh" typeface="Microsoft Uighur"/>
+        <a:font script="Geor" typeface="Sylfaen"/>
+        <a:font script="Armn" typeface="Arial"/>
+        <a:font script="Bugi" typeface="Leelawadee UI"/>
+        <a:font script="Bopo" typeface="Microsoft JhengHei"/>
+        <a:font script="Java" typeface="Javanese Text"/>
+        <a:font script="Lisu" typeface="Segoe UI"/>
+        <a:font script="Mymr" typeface="Myanmar Text"/>
+        <a:font script="Nkoo" typeface="Ebrima"/>
+        <a:font script="Olck" typeface="Nirmala UI"/>
+        <a:font script="Osma" typeface="Ebrima"/>
+        <a:font script="Phag" typeface="Phagspa"/>
+        <a:font script="Syrn" typeface="Estrangelo Edessa"/>
+        <a:font script="Syrj" typeface="Estrangelo Edessa"/>
+        <a:font script="Syre" typeface="Estrangelo Edessa"/>
+        <a:font script="Sora" typeface="Nirmala UI"/>
+        <a:font script="Tale" typeface="Microsoft Tai Le"/>
+        <a:font script="Talu" typeface="Microsoft New Tai Lue"/>
+        <a:font script="Tfng" typeface="Ebrima"/>
       </a:majorFont>
       <a:minorFont>
-        <a:latin typeface="Cambria"/>
+        <a:latin typeface="Aptos" panose="02110004020202020204"/>
         <a:ea typeface=""/>
         <a:cs typeface=""/>
-        <a:font script="Jpan" typeface="ＭＳ 明朝"/>
+        <a:font script="Jpan" typeface="游明朝"/>
         <a:font script="Hang" typeface="맑은 고딕"/>
-        <a:font script="Hans" typeface="宋体"/>
+        <a:font script="Hans" typeface="等线"/>
         <a:font script="Hant" typeface="新細明體"/>
         <a:font script="Arab" typeface="Arial"/>
         <a:font script="Hebr" typeface="Arial"/>
@@ -4214,6 +4217,24 @@
         <a:font script="Mong" typeface="Mongolian Baiti"/>
         <a:font script="Viet" typeface="Arial"/>
         <a:font script="Uigh" typeface="Microsoft Uighur"/>
+        <a:font script="Geor" typeface="Sylfaen"/>
+        <a:font script="Armn" typeface="Arial"/>
+        <a:font script="Bugi" typeface="Leelawadee UI"/>
+        <a:font script="Bopo" typeface="Microsoft JhengHei"/>
+        <a:font script="Java" typeface="Javanese Text"/>
+        <a:font script="Lisu" typeface="Segoe UI"/>
+        <a:font script="Mymr" typeface="Myanmar Text"/>
+        <a:font script="Nkoo" typeface="Ebrima"/>
+        <a:font script="Olck" typeface="Nirmala UI"/>
+        <a:font script="Osma" typeface="Ebrima"/>
+        <a:font script="Phag" typeface="Phagspa"/>
+        <a:font script="Syrn" typeface="Estrangelo Edessa"/>
+        <a:font script="Syrj" typeface="Estrangelo Edessa"/>
+        <a:font script="Syre" typeface="Estrangelo Edessa"/>
+        <a:font script="Sora" typeface="Nirmala UI"/>
+        <a:font script="Tale" typeface="Microsoft Tai Le"/>
+        <a:font script="Talu" typeface="Microsoft New Tai Lue"/>
+        <a:font script="Tfng" typeface="Ebrima"/>
       </a:minorFont>
     </a:fontScheme>
     <a:fmtScheme name="Office">
@@ -4225,200 +4246,141 @@
           <a:gsLst>
             <a:gs pos="0">
               <a:schemeClr val="phClr">
-                <a:tint val="50000"/>
-                <a:satMod val="300000"/>
+                <a:lumMod val="110000"/>
+                <a:satMod val="105000"/>
+                <a:tint val="67000"/>
               </a:schemeClr>
             </a:gs>
-            <a:gs pos="35000">
+            <a:gs pos="50000">
               <a:schemeClr val="phClr">
-                <a:tint val="37000"/>
-                <a:satMod val="300000"/>
+                <a:lumMod val="105000"/>
+                <a:satMod val="103000"/>
+                <a:tint val="73000"/>
               </a:schemeClr>
             </a:gs>
             <a:gs pos="100000">
               <a:schemeClr val="phClr">
-                <a:tint val="15000"/>
-                <a:satMod val="350000"/>
+                <a:lumMod val="105000"/>
+                <a:satMod val="109000"/>
+                <a:tint val="81000"/>
               </a:schemeClr>
             </a:gs>
           </a:gsLst>
-          <a:lin ang="16200000" scaled="1"/>
+          <a:lin ang="5400000" scaled="0"/>
         </a:gradFill>
         <a:gradFill rotWithShape="1">
           <a:gsLst>
             <a:gs pos="0">
               <a:schemeClr val="phClr">
-                <a:tint val="100000"/>
+                <a:satMod val="103000"/>
+                <a:lumMod val="102000"/>
+                <a:tint val="94000"/>
+              </a:schemeClr>
+            </a:gs>
+            <a:gs pos="50000">
+              <a:schemeClr val="phClr">
+                <a:satMod val="110000"/>
+                <a:lumMod val="100000"/>
                 <a:shade val="100000"/>
-                <a:satMod val="130000"/>
               </a:schemeClr>
             </a:gs>
             <a:gs pos="100000">
               <a:schemeClr val="phClr">
-                <a:tint val="50000"/>
-                <a:shade val="100000"/>
-                <a:satMod val="350000"/>
+                <a:lumMod val="99000"/>
+                <a:satMod val="120000"/>
+                <a:shade val="78000"/>
               </a:schemeClr>
             </a:gs>
           </a:gsLst>
-          <a:lin ang="16200000" scaled="0"/>
+          <a:lin ang="5400000" scaled="0"/>
         </a:gradFill>
       </a:fillStyleLst>
       <a:lnStyleLst>
-        <a:ln w="9525" cap="flat" cmpd="sng" algn="ctr">
-          <a:solidFill>
-            <a:schemeClr val="phClr">
-              <a:shade val="95000"/>
-              <a:satMod val="105000"/>
-            </a:schemeClr>
-          </a:solidFill>
-          <a:prstDash val="solid"/>
-        </a:ln>
-        <a:ln w="25400" cap="flat" cmpd="sng" algn="ctr">
+        <a:ln w="6350" cap="flat" cmpd="sng" algn="ctr">
           <a:solidFill>
             <a:schemeClr val="phClr"/>
           </a:solidFill>
           <a:prstDash val="solid"/>
+          <a:miter lim="800000"/>
         </a:ln>
-        <a:ln w="38100" cap="flat" cmpd="sng" algn="ctr">
+        <a:ln w="12700" cap="flat" cmpd="sng" algn="ctr">
           <a:solidFill>
             <a:schemeClr val="phClr"/>
           </a:solidFill>
           <a:prstDash val="solid"/>
+          <a:miter lim="800000"/>
+        </a:ln>
+        <a:ln w="19050" cap="flat" cmpd="sng" algn="ctr">
+          <a:solidFill>
+            <a:schemeClr val="phClr"/>
+          </a:solidFill>
+          <a:prstDash val="solid"/>
+          <a:miter lim="800000"/>
         </a:ln>
       </a:lnStyleLst>
       <a:effectStyleLst>
         <a:effectStyle>
+          <a:effectLst/>
+        </a:effectStyle>
+        <a:effectStyle>
+          <a:effectLst/>
+        </a:effectStyle>
+        <a:effectStyle>
           <a:effectLst>
-            <a:outerShdw blurRad="40000" dist="20000" dir="5400000" rotWithShape="0">
+            <a:outerShdw blurRad="57150" dist="19050" dir="5400000" algn="ctr" rotWithShape="0">
               <a:srgbClr val="000000">
-                <a:alpha val="38000"/>
+                <a:alpha val="63000"/>
               </a:srgbClr>
             </a:outerShdw>
           </a:effectLst>
-        </a:effectStyle>
-        <a:effectStyle>
-          <a:effectLst>
-            <a:outerShdw blurRad="40000" dist="23000" dir="5400000" rotWithShape="0">
-              <a:srgbClr val="000000">
-                <a:alpha val="35000"/>
-              </a:srgbClr>
-            </a:outerShdw>
-          </a:effectLst>
-        </a:effectStyle>
-        <a:effectStyle>
-          <a:effectLst>
-            <a:outerShdw blurRad="40000" dist="23000" dir="5400000" rotWithShape="0">
-              <a:srgbClr val="000000">
-                <a:alpha val="35000"/>
-              </a:srgbClr>
-            </a:outerShdw>
-          </a:effectLst>
-          <a:scene3d>
-            <a:camera prst="orthographicFront">
-              <a:rot lat="0" lon="0" rev="0"/>
-            </a:camera>
-            <a:lightRig rig="threePt" dir="t">
-              <a:rot lat="0" lon="0" rev="1200000"/>
-            </a:lightRig>
-          </a:scene3d>
-          <a:sp3d>
-            <a:bevelT w="63500" h="25400"/>
-          </a:sp3d>
         </a:effectStyle>
       </a:effectStyleLst>
       <a:bgFillStyleLst>
         <a:solidFill>
           <a:schemeClr val="phClr"/>
         </a:solidFill>
+        <a:solidFill>
+          <a:schemeClr val="phClr">
+            <a:tint val="95000"/>
+            <a:satMod val="170000"/>
+          </a:schemeClr>
+        </a:solidFill>
         <a:gradFill rotWithShape="1">
           <a:gsLst>
             <a:gs pos="0">
               <a:schemeClr val="phClr">
-                <a:tint val="40000"/>
-                <a:satMod val="350000"/>
+                <a:tint val="93000"/>
+                <a:satMod val="150000"/>
+                <a:shade val="98000"/>
+                <a:lumMod val="102000"/>
               </a:schemeClr>
             </a:gs>
-            <a:gs pos="40000">
+            <a:gs pos="50000">
               <a:schemeClr val="phClr">
-                <a:tint val="45000"/>
-                <a:shade val="99000"/>
-                <a:satMod val="350000"/>
+                <a:tint val="98000"/>
+                <a:satMod val="130000"/>
+                <a:shade val="90000"/>
+                <a:lumMod val="103000"/>
               </a:schemeClr>
             </a:gs>
             <a:gs pos="100000">
               <a:schemeClr val="phClr">
-                <a:shade val="20000"/>
-                <a:satMod val="255000"/>
+                <a:shade val="63000"/>
+                <a:satMod val="120000"/>
               </a:schemeClr>
             </a:gs>
           </a:gsLst>
-          <a:path path="circle">
-            <a:fillToRect l="50000" t="-80000" r="50000" b="180000"/>
-          </a:path>
-        </a:gradFill>
-        <a:gradFill rotWithShape="1">
-          <a:gsLst>
-            <a:gs pos="0">
-              <a:schemeClr val="phClr">
-                <a:tint val="80000"/>
-                <a:satMod val="300000"/>
-              </a:schemeClr>
-            </a:gs>
-            <a:gs pos="100000">
-              <a:schemeClr val="phClr">
-                <a:shade val="30000"/>
-                <a:satMod val="200000"/>
-              </a:schemeClr>
-            </a:gs>
-          </a:gsLst>
-          <a:path path="circle">
-            <a:fillToRect l="50000" t="50000" r="50000" b="50000"/>
-          </a:path>
+          <a:lin ang="5400000" scaled="0"/>
         </a:gradFill>
       </a:bgFillStyleLst>
     </a:fmtScheme>
   </a:themeElements>
-  <a:objectDefaults>
-    <a:spDef>
-      <a:spPr/>
-      <a:bodyPr/>
-      <a:lstStyle/>
-      <a:style>
-        <a:lnRef idx="1">
-          <a:schemeClr val="accent1"/>
-        </a:lnRef>
-        <a:fillRef idx="3">
-          <a:schemeClr val="accent1"/>
-        </a:fillRef>
-        <a:effectRef idx="2">
-          <a:schemeClr val="accent1"/>
-        </a:effectRef>
-        <a:fontRef idx="minor">
-          <a:schemeClr val="lt1"/>
-        </a:fontRef>
-      </a:style>
-    </a:spDef>
-    <a:lnDef>
-      <a:spPr/>
-      <a:bodyPr/>
-      <a:lstStyle/>
-      <a:style>
-        <a:lnRef idx="2">
-          <a:schemeClr val="accent1"/>
-        </a:lnRef>
-        <a:fillRef idx="0">
-          <a:schemeClr val="accent1"/>
-        </a:fillRef>
-        <a:effectRef idx="1">
-          <a:schemeClr val="accent1"/>
-        </a:effectRef>
-        <a:fontRef idx="minor">
-          <a:schemeClr val="tx1"/>
-        </a:fontRef>
-      </a:style>
-    </a:lnDef>
-  </a:objectDefaults>
+  <a:objectDefaults/>
   <a:extraClrSchemeLst/>
+  <a:extLst>
+    <a:ext uri="{05A4C25C-085E-4340-85A3-A5531E510DB2}">
+      <thm15:themeFamily xmlns:thm15="http://schemas.microsoft.com/office/thememl/2012/main" name="Office Theme" id="{2E142A2C-CD16-42D6-873A-C26D2A0506FA}" vid="{1BDDFF52-6CD6-40A5-AB3C-68EB2F1E4D0A}"/>
+    </a:ext>
+  </a:extLst>
 </a:theme>
 </file>
</xml_diff>